<commit_message>
Lots of tiny, picky edits
</commit_message>
<xml_diff>
--- a/StudentGuideModule2/biot_savart_straight_wire/straight_wire.docx
+++ b/StudentGuideModule2/biot_savart_straight_wire/straight_wire.docx
@@ -1,9 +1,8 @@
 
 <file path=word/document.xml><?xml version="1.0" encoding="utf-8"?>
-<w:document xmlns:wpc="http://schemas.microsoft.com/office/word/2010/wordprocessingCanvas" xmlns:mc="http://schemas.openxmlformats.org/markup-compatibility/2006" xmlns:o="urn:schemas-microsoft-com:office:office" xmlns:r="http://schemas.openxmlformats.org/officeDocument/2006/relationships" xmlns:m="http://schemas.openxmlformats.org/officeDocument/2006/math" xmlns:v="urn:schemas-microsoft-com:vml" xmlns:wp14="http://schemas.microsoft.com/office/word/2010/wordprocessingDrawing" xmlns:wp="http://schemas.openxmlformats.org/drawingml/2006/wordprocessingDrawing" xmlns:w10="urn:schemas-microsoft-com:office:word" xmlns:w="http://schemas.openxmlformats.org/wordprocessingml/2006/main" xmlns:w14="http://schemas.microsoft.com/office/word/2010/wordml" xmlns:wpg="http://schemas.microsoft.com/office/word/2010/wordprocessingGroup" xmlns:wpi="http://schemas.microsoft.com/office/word/2010/wordprocessingInk" xmlns:wne="http://schemas.microsoft.com/office/word/2006/wordml" xmlns:wps="http://schemas.microsoft.com/office/word/2010/wordprocessingShape" mc:Ignorable="w14 wp14">
+<w:document xmlns:wpc="http://schemas.microsoft.com/office/word/2010/wordprocessingCanvas" xmlns:cx="http://schemas.microsoft.com/office/drawing/2014/chartex" xmlns:cx1="http://schemas.microsoft.com/office/drawing/2015/9/8/chartex" xmlns:cx2="http://schemas.microsoft.com/office/drawing/2015/10/21/chartex" xmlns:cx3="http://schemas.microsoft.com/office/drawing/2016/5/9/chartex" xmlns:cx4="http://schemas.microsoft.com/office/drawing/2016/5/10/chartex" xmlns:cx5="http://schemas.microsoft.com/office/drawing/2016/5/11/chartex" xmlns:cx6="http://schemas.microsoft.com/office/drawing/2016/5/12/chartex" xmlns:cx7="http://schemas.microsoft.com/office/drawing/2016/5/13/chartex" xmlns:cx8="http://schemas.microsoft.com/office/drawing/2016/5/14/chartex" xmlns:mc="http://schemas.openxmlformats.org/markup-compatibility/2006" xmlns:aink="http://schemas.microsoft.com/office/drawing/2016/ink" xmlns:am3d="http://schemas.microsoft.com/office/drawing/2017/model3d" xmlns:o="urn:schemas-microsoft-com:office:office" xmlns:oel="http://schemas.microsoft.com/office/2019/extlst" xmlns:r="http://schemas.openxmlformats.org/officeDocument/2006/relationships" xmlns:m="http://schemas.openxmlformats.org/officeDocument/2006/math" xmlns:v="urn:schemas-microsoft-com:vml" xmlns:wp14="http://schemas.microsoft.com/office/word/2010/wordprocessingDrawing" xmlns:wp="http://schemas.openxmlformats.org/drawingml/2006/wordprocessingDrawing" xmlns:w10="urn:schemas-microsoft-com:office:word" xmlns:w="http://schemas.openxmlformats.org/wordprocessingml/2006/main" xmlns:w14="http://schemas.microsoft.com/office/word/2010/wordml" xmlns:w15="http://schemas.microsoft.com/office/word/2012/wordml" xmlns:w16cex="http://schemas.microsoft.com/office/word/2018/wordml/cex" xmlns:w16cid="http://schemas.microsoft.com/office/word/2016/wordml/cid" xmlns:w16="http://schemas.microsoft.com/office/word/2018/wordml" xmlns:w16du="http://schemas.microsoft.com/office/word/2023/wordml/word16du" xmlns:w16sdtdh="http://schemas.microsoft.com/office/word/2020/wordml/sdtdatahash" xmlns:w16sdtfl="http://schemas.microsoft.com/office/word/2024/wordml/sdtformatlock" xmlns:w16se="http://schemas.microsoft.com/office/word/2015/wordml/symex" xmlns:wpg="http://schemas.microsoft.com/office/word/2010/wordprocessingGroup" xmlns:wpi="http://schemas.microsoft.com/office/word/2010/wordprocessingInk" xmlns:wne="http://schemas.microsoft.com/office/word/2006/wordml" xmlns:wps="http://schemas.microsoft.com/office/word/2010/wordprocessingShape" mc:Ignorable="w14 w15 w16se w16cid w16 w16cex w16sdtdh w16sdtfl w16du wp14">
   <w:body>
     <w:p>
-      <w:bookmarkStart w:id="0" w:name="_GoBack"/>
       <w:r>
         <w:rPr>
           <w:noProof/>
@@ -11,16 +10,16 @@
         <mc:AlternateContent>
           <mc:Choice Requires="wpg">
             <w:drawing>
-              <wp:anchor distT="0" distB="0" distL="114300" distR="114300" simplePos="0" relativeHeight="251659264" behindDoc="0" locked="0" layoutInCell="1" allowOverlap="1" wp14:anchorId="12707729" wp14:editId="7F981C95">
+              <wp:anchor distT="0" distB="0" distL="114300" distR="114300" simplePos="0" relativeHeight="251659264" behindDoc="0" locked="0" layoutInCell="1" allowOverlap="1" wp14:anchorId="12707729" wp14:editId="2F957A1F">
                 <wp:simplePos x="0" y="0"/>
                 <wp:positionH relativeFrom="column">
-                  <wp:posOffset>1146810</wp:posOffset>
+                  <wp:posOffset>1147233</wp:posOffset>
                 </wp:positionH>
                 <wp:positionV relativeFrom="paragraph">
-                  <wp:posOffset>953770</wp:posOffset>
+                  <wp:posOffset>954617</wp:posOffset>
                 </wp:positionV>
                 <wp:extent cx="3565502" cy="1120189"/>
-                <wp:effectExtent l="0" t="0" r="16510" b="3810"/>
+                <wp:effectExtent l="0" t="0" r="35560" b="0"/>
                 <wp:wrapNone/>
                 <wp:docPr id="26" name="Group 26"/>
                 <wp:cNvGraphicFramePr/>
@@ -43,7 +42,7 @@
                         </wps:cNvSpPr>
                         <wps:spPr bwMode="auto">
                           <a:xfrm>
-                            <a:off x="427892" y="838200"/>
+                            <a:off x="419425" y="814917"/>
                             <a:ext cx="334010" cy="281305"/>
                           </a:xfrm>
                           <a:prstGeom prst="rect">
@@ -79,16 +78,22 @@
                               <w:pPr>
                                 <w:rPr>
                                   <w:i/>
-                                  <w:sz w:val="18"/>
+                                  <w:sz w:val="20"/>
+                                  <w:szCs w:val="28"/>
                                 </w:rPr>
                               </w:pPr>
-                              <w:r>
-                                <w:rPr>
-                                  <w:i/>
-                                  <w:sz w:val="18"/>
-                                </w:rPr>
-                                <w:t>I</w:t>
-                              </w:r>
+                              <m:oMathPara>
+                                <m:oMath>
+                                  <m:r>
+                                    <w:rPr>
+                                      <w:rFonts w:ascii="Cambria Math" w:hAnsi="Cambria Math"/>
+                                      <w:sz w:val="20"/>
+                                      <w:szCs w:val="28"/>
+                                    </w:rPr>
+                                    <m:t>I</m:t>
+                                  </m:r>
+                                </m:oMath>
+                              </m:oMathPara>
                             </w:p>
                           </w:txbxContent>
                         </wps:txbx>
@@ -139,18 +144,22 @@
                               <w:pPr>
                                 <w:rPr>
                                   <w:i/>
-                                  <w:sz w:val="18"/>
+                                  <w:sz w:val="20"/>
+                                  <w:szCs w:val="28"/>
                                 </w:rPr>
                               </w:pPr>
-                              <w:proofErr w:type="gramStart"/>
-                              <w:r>
-                                <w:rPr>
-                                  <w:i/>
-                                  <w:sz w:val="18"/>
-                                </w:rPr>
-                                <w:t>x</w:t>
-                              </w:r>
-                              <w:proofErr w:type="gramEnd"/>
+                              <m:oMathPara>
+                                <m:oMath>
+                                  <m:r>
+                                    <w:rPr>
+                                      <w:rFonts w:ascii="Cambria Math" w:hAnsi="Cambria Math"/>
+                                      <w:sz w:val="20"/>
+                                      <w:szCs w:val="28"/>
+                                    </w:rPr>
+                                    <m:t>x</m:t>
+                                  </m:r>
+                                </m:oMath>
+                              </m:oMathPara>
                             </w:p>
                           </w:txbxContent>
                         </wps:txbx>
@@ -208,7 +217,6 @@
                           <a:ln>
                             <a:noFill/>
                           </a:ln>
-                          <a:extLst/>
                         </wps:spPr>
                         <wps:txbx>
                           <w:txbxContent>
@@ -216,16 +224,22 @@
                               <w:pPr>
                                 <w:rPr>
                                   <w:i/>
-                                  <w:sz w:val="18"/>
+                                  <w:sz w:val="20"/>
+                                  <w:szCs w:val="28"/>
                                 </w:rPr>
                               </w:pPr>
-                              <w:r>
-                                <w:rPr>
-                                  <w:i/>
-                                  <w:sz w:val="18"/>
-                                </w:rPr>
-                                <w:t>P</w:t>
-                              </w:r>
+                              <m:oMathPara>
+                                <m:oMath>
+                                  <m:r>
+                                    <w:rPr>
+                                      <w:rFonts w:ascii="Cambria Math" w:hAnsi="Cambria Math"/>
+                                      <w:sz w:val="20"/>
+                                      <w:szCs w:val="28"/>
+                                    </w:rPr>
+                                    <m:t>P</m:t>
+                                  </m:r>
+                                </m:oMath>
+                              </m:oMathPara>
                             </w:p>
                           </w:txbxContent>
                         </wps:txbx>
@@ -248,7 +262,7 @@
                             <a:solidFill>
                               <a:schemeClr val="tx1"/>
                             </a:solidFill>
-                            <a:headEnd type="arrow" w="med" len="med"/>
+                            <a:headEnd type="arrow" w="sm" len="sm"/>
                             <a:tailEnd type="none" w="med" len="med"/>
                           </a:ln>
                         </wps:spPr>
@@ -305,7 +319,8 @@
                             <w:p>
                               <w:pPr>
                                 <w:rPr>
-                                  <w:sz w:val="18"/>
+                                  <w:sz w:val="20"/>
+                                  <w:szCs w:val="28"/>
                                 </w:rPr>
                               </w:pPr>
                               <m:oMathPara>
@@ -317,7 +332,8 @@
                                         <w:rPr>
                                           <w:rFonts w:ascii="Cambria Math" w:hAnsi="Cambria Math"/>
                                           <w:i/>
-                                          <w:sz w:val="18"/>
+                                          <w:sz w:val="20"/>
+                                          <w:szCs w:val="28"/>
                                         </w:rPr>
                                       </m:ctrlPr>
                                     </m:accPr>
@@ -325,7 +341,8 @@
                                       <m:r>
                                         <w:rPr>
                                           <w:rFonts w:ascii="Cambria Math" w:hAnsi="Cambria Math"/>
-                                          <w:sz w:val="18"/>
+                                          <w:sz w:val="20"/>
+                                          <w:szCs w:val="28"/>
                                         </w:rPr>
                                         <m:t>ds</m:t>
                                       </m:r>
@@ -357,7 +374,6 @@
                           <a:ln>
                             <a:noFill/>
                           </a:ln>
-                          <a:extLst/>
                         </wps:spPr>
                         <wps:txbx>
                           <w:txbxContent>
@@ -365,18 +381,22 @@
                               <w:pPr>
                                 <w:rPr>
                                   <w:i/>
-                                  <w:sz w:val="18"/>
+                                  <w:sz w:val="20"/>
+                                  <w:szCs w:val="28"/>
                                 </w:rPr>
                               </w:pPr>
-                              <w:proofErr w:type="gramStart"/>
-                              <w:r>
-                                <w:rPr>
-                                  <w:i/>
-                                  <w:sz w:val="18"/>
-                                </w:rPr>
-                                <w:t>y</w:t>
-                              </w:r>
-                              <w:proofErr w:type="gramEnd"/>
+                              <m:oMathPara>
+                                <m:oMath>
+                                  <m:r>
+                                    <w:rPr>
+                                      <w:rFonts w:ascii="Cambria Math" w:hAnsi="Cambria Math"/>
+                                      <w:sz w:val="20"/>
+                                      <w:szCs w:val="28"/>
+                                    </w:rPr>
+                                    <m:t>y</m:t>
+                                  </m:r>
+                                </m:oMath>
+                              </m:oMathPara>
                             </w:p>
                           </w:txbxContent>
                         </wps:txbx>
@@ -401,7 +421,6 @@
                           <a:ln>
                             <a:noFill/>
                           </a:ln>
-                          <a:extLst/>
                         </wps:spPr>
                         <wps:txbx>
                           <w:txbxContent>
@@ -409,7 +428,8 @@
                               <w:pPr>
                                 <w:rPr>
                                   <w:i/>
-                                  <w:sz w:val="18"/>
+                                  <w:sz w:val="20"/>
+                                  <w:szCs w:val="28"/>
                                 </w:rPr>
                               </w:pPr>
                               <m:oMathPara>
@@ -420,7 +440,8 @@
                                         <w:rPr>
                                           <w:rFonts w:ascii="Cambria Math" w:hAnsi="Cambria Math"/>
                                           <w:i/>
-                                          <w:sz w:val="18"/>
+                                          <w:sz w:val="20"/>
+                                          <w:szCs w:val="28"/>
                                         </w:rPr>
                                       </m:ctrlPr>
                                     </m:sSubPr>
@@ -428,16 +449,21 @@
                                       <m:r>
                                         <w:rPr>
                                           <w:rFonts w:ascii="Cambria Math" w:hAnsi="Cambria Math"/>
-                                          <w:sz w:val="18"/>
+                                          <w:sz w:val="20"/>
+                                          <w:szCs w:val="28"/>
                                         </w:rPr>
                                         <m:t>θ</m:t>
                                       </m:r>
                                     </m:e>
                                     <m:sub>
                                       <m:r>
+                                        <m:rPr>
+                                          <m:sty m:val="p"/>
+                                        </m:rPr>
                                         <w:rPr>
                                           <w:rFonts w:ascii="Cambria Math" w:hAnsi="Cambria Math"/>
-                                          <w:sz w:val="18"/>
+                                          <w:sz w:val="20"/>
+                                          <w:szCs w:val="28"/>
                                         </w:rPr>
                                         <m:t>out</m:t>
                                       </m:r>
@@ -469,7 +495,6 @@
                           <a:ln>
                             <a:noFill/>
                           </a:ln>
-                          <a:extLst/>
                         </wps:spPr>
                         <wps:txbx>
                           <w:txbxContent>
@@ -477,7 +502,8 @@
                               <w:pPr>
                                 <w:rPr>
                                   <w:i/>
-                                  <w:sz w:val="18"/>
+                                  <w:sz w:val="20"/>
+                                  <w:szCs w:val="28"/>
                                 </w:rPr>
                               </w:pPr>
                               <m:oMathPara>
@@ -488,7 +514,8 @@
                                         <w:rPr>
                                           <w:rFonts w:ascii="Cambria Math" w:hAnsi="Cambria Math"/>
                                           <w:i/>
-                                          <w:sz w:val="18"/>
+                                          <w:sz w:val="20"/>
+                                          <w:szCs w:val="28"/>
                                         </w:rPr>
                                       </m:ctrlPr>
                                     </m:sSubPr>
@@ -496,16 +523,21 @@
                                       <m:r>
                                         <w:rPr>
                                           <w:rFonts w:ascii="Cambria Math" w:hAnsi="Cambria Math"/>
-                                          <w:sz w:val="18"/>
+                                          <w:sz w:val="20"/>
+                                          <w:szCs w:val="28"/>
                                         </w:rPr>
                                         <m:t>θ</m:t>
                                       </m:r>
                                     </m:e>
                                     <m:sub>
                                       <m:r>
+                                        <m:rPr>
+                                          <m:sty m:val="p"/>
+                                        </m:rPr>
                                         <w:rPr>
                                           <w:rFonts w:ascii="Cambria Math" w:hAnsi="Cambria Math"/>
-                                          <w:sz w:val="18"/>
+                                          <w:sz w:val="20"/>
+                                          <w:szCs w:val="28"/>
                                         </w:rPr>
                                         <m:t>in</m:t>
                                       </m:r>
@@ -604,13 +636,13 @@
                         <wps:cNvCnPr/>
                         <wps:spPr>
                           <a:xfrm flipH="1">
-                            <a:off x="2661138" y="797169"/>
-                            <a:ext cx="257810" cy="0"/>
+                            <a:off x="2707707" y="797169"/>
+                            <a:ext cx="182880" cy="0"/>
                           </a:xfrm>
                           <a:prstGeom prst="straightConnector1">
                             <a:avLst/>
                           </a:prstGeom>
-                          <a:ln w="28575">
+                          <a:ln w="19050">
                             <a:solidFill>
                               <a:schemeClr val="tx1"/>
                             </a:solidFill>
@@ -726,73 +758,89 @@
           </mc:Choice>
           <mc:Fallback>
             <w:pict>
-              <v:group id="Group 26" o:spid="_x0000_s1026" style="position:absolute;margin-left:90.3pt;margin-top:75.1pt;width:280.75pt;height:88.2pt;z-index:251659264;mso-width-relative:margin;mso-height-relative:margin" coordsize="35655,11201" o:gfxdata="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">
+              <v:group w14:anchorId="12707729" id="Group 26" o:spid="_x0000_s1026" style="position:absolute;margin-left:90.35pt;margin-top:75.15pt;width:280.75pt;height:88.2pt;z-index:251659264;mso-width-relative:margin;mso-height-relative:margin" coordsize="35655,11201" o:gfxdata="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">
                 <v:shapetype id="_x0000_t202" coordsize="21600,21600" o:spt="202" path="m,l,21600r21600,l21600,xe">
                   <v:stroke joinstyle="miter"/>
                   <v:path gradientshapeok="t" o:connecttype="rect"/>
                 </v:shapetype>
-                <v:shape id="Text Box 6" o:spid="_x0000_s1027" type="#_x0000_t202" style="position:absolute;left:4278;top:8382;width:3341;height:2813;visibility:visible;mso-wrap-style:square;v-text-anchor:top" o:gfxdata="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" filled="f" stroked="f">
+                <v:shape id="Text Box 6" o:spid="_x0000_s1027" type="#_x0000_t202" style="position:absolute;left:4194;top:8149;width:3340;height:2813;visibility:visible;mso-wrap-style:square;v-text-anchor:top" o:gfxdata="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" filled="f" stroked="f">
                   <v:textbox>
                     <w:txbxContent>
                       <w:p>
                         <w:pPr>
                           <w:rPr>
                             <w:i/>
-                            <w:sz w:val="18"/>
+                            <w:sz w:val="20"/>
+                            <w:szCs w:val="28"/>
                           </w:rPr>
                         </w:pPr>
-                        <w:r>
-                          <w:rPr>
-                            <w:i/>
-                            <w:sz w:val="18"/>
-                          </w:rPr>
-                          <w:t>I</w:t>
-                        </w:r>
+                        <m:oMathPara>
+                          <m:oMath>
+                            <m:r>
+                              <w:rPr>
+                                <w:rFonts w:ascii="Cambria Math" w:hAnsi="Cambria Math"/>
+                                <w:sz w:val="20"/>
+                                <w:szCs w:val="28"/>
+                              </w:rPr>
+                              <m:t>I</m:t>
+                            </m:r>
+                          </m:oMath>
+                        </m:oMathPara>
                       </w:p>
                     </w:txbxContent>
                   </v:textbox>
                 </v:shape>
-                <v:shape id="Text Box 31" o:spid="_x0000_s1028" type="#_x0000_t202" style="position:absolute;left:22098;top:8030;width:2692;height:2813;visibility:visible;mso-wrap-style:square;v-text-anchor:top" o:gfxdata="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" filled="f" stroked="f">
+                <v:shape id="Text Box 31" o:spid="_x0000_s1028" type="#_x0000_t202" style="position:absolute;left:22098;top:8030;width:2692;height:2813;visibility:visible;mso-wrap-style:square;v-text-anchor:top" o:gfxdata="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" filled="f" stroked="f">
                   <v:textbox>
                     <w:txbxContent>
                       <w:p>
                         <w:pPr>
                           <w:rPr>
                             <w:i/>
-                            <w:sz w:val="18"/>
+                            <w:sz w:val="20"/>
+                            <w:szCs w:val="28"/>
                           </w:rPr>
                         </w:pPr>
-                        <w:proofErr w:type="gramStart"/>
-                        <w:r>
-                          <w:rPr>
-                            <w:i/>
-                            <w:sz w:val="18"/>
-                          </w:rPr>
-                          <w:t>x</w:t>
-                        </w:r>
-                        <w:proofErr w:type="gramEnd"/>
+                        <m:oMathPara>
+                          <m:oMath>
+                            <m:r>
+                              <w:rPr>
+                                <w:rFonts w:ascii="Cambria Math" w:hAnsi="Cambria Math"/>
+                                <w:sz w:val="20"/>
+                                <w:szCs w:val="28"/>
+                              </w:rPr>
+                              <m:t>x</m:t>
+                            </m:r>
+                          </m:oMath>
+                        </m:oMathPara>
                       </w:p>
                     </w:txbxContent>
                   </v:textbox>
                 </v:shape>
-                <v:line id="Straight Connector 22" o:spid="_x0000_s1029" style="position:absolute;visibility:visible;mso-wrap-style:square" from="0,8029" to="35655,8029" o:connectortype="straight" o:gfxdata="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" strokecolor="black [3213]"/>
-                <v:shape id="Text Box 9" o:spid="_x0000_s1030" type="#_x0000_t202" style="position:absolute;left:15650;width:2279;height:2597;visibility:visible;mso-wrap-style:square;v-text-anchor:top" o:gfxdata="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" filled="f" stroked="f">
+                <v:line id="Straight Connector 22" o:spid="_x0000_s1029" style="position:absolute;visibility:visible;mso-wrap-style:square" from="0,8029" to="35655,8029" o:connectortype="straight" o:gfxdata="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" strokecolor="black [3213]"/>
+                <v:shape id="Text Box 9" o:spid="_x0000_s1030" type="#_x0000_t202" style="position:absolute;left:15650;width:2279;height:2597;visibility:visible;mso-wrap-style:square;v-text-anchor:top" o:gfxdata="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" filled="f" stroked="f">
                   <v:textbox>
                     <w:txbxContent>
                       <w:p>
                         <w:pPr>
                           <w:rPr>
                             <w:i/>
-                            <w:sz w:val="18"/>
+                            <w:sz w:val="20"/>
+                            <w:szCs w:val="28"/>
                           </w:rPr>
                         </w:pPr>
-                        <w:r>
-                          <w:rPr>
-                            <w:i/>
-                            <w:sz w:val="18"/>
-                          </w:rPr>
-                          <w:t>P</w:t>
-                        </w:r>
+                        <m:oMathPara>
+                          <m:oMath>
+                            <m:r>
+                              <w:rPr>
+                                <w:rFonts w:ascii="Cambria Math" w:hAnsi="Cambria Math"/>
+                                <w:sz w:val="20"/>
+                                <w:szCs w:val="28"/>
+                              </w:rPr>
+                              <m:t>P</m:t>
+                            </m:r>
+                          </m:oMath>
+                        </m:oMathPara>
                       </w:p>
                     </w:txbxContent>
                   </v:textbox>
@@ -801,16 +849,17 @@
                   <v:path arrowok="t" fillok="f" o:connecttype="none"/>
                   <o:lock v:ext="edit" shapetype="t"/>
                 </v:shapetype>
-                <v:shape id="Straight Arrow Connector 20" o:spid="_x0000_s1031" type="#_x0000_t32" style="position:absolute;left:2168;top:9378;width:2750;height:0;flip:x;visibility:visible;mso-wrap-style:square" o:connectortype="straight" o:gfxdata="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" strokecolor="black [3213]">
-                  <v:stroke startarrow="open"/>
+                <v:shape id="Straight Arrow Connector 20" o:spid="_x0000_s1031" type="#_x0000_t32" style="position:absolute;left:2168;top:9378;width:2750;height:0;flip:x;visibility:visible;mso-wrap-style:square" o:connectortype="straight" o:gfxdata="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" strokecolor="black [3213]">
+                  <v:stroke startarrow="open" startarrowwidth="narrow" startarrowlength="short"/>
                 </v:shape>
-                <v:shape id="Text Box 9" o:spid="_x0000_s1032" type="#_x0000_t202" style="position:absolute;left:26318;top:8088;width:3353;height:2591;visibility:visible;mso-wrap-style:square;v-text-anchor:top" o:gfxdata="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" stroked="f">
+                <v:shape id="Text Box 9" o:spid="_x0000_s1032" type="#_x0000_t202" style="position:absolute;left:26318;top:8088;width:3353;height:2591;visibility:visible;mso-wrap-style:square;v-text-anchor:top" o:gfxdata="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" stroked="f">
                   <v:textbox>
                     <w:txbxContent>
                       <w:p>
                         <w:pPr>
                           <w:rPr>
-                            <w:sz w:val="18"/>
+                            <w:sz w:val="20"/>
+                            <w:szCs w:val="28"/>
                           </w:rPr>
                         </w:pPr>
                         <m:oMathPara>
@@ -822,7 +871,8 @@
                                   <w:rPr>
                                     <w:rFonts w:ascii="Cambria Math" w:hAnsi="Cambria Math"/>
                                     <w:i/>
-                                    <w:sz w:val="18"/>
+                                    <w:sz w:val="20"/>
+                                    <w:szCs w:val="28"/>
                                   </w:rPr>
                                 </m:ctrlPr>
                               </m:accPr>
@@ -830,7 +880,8 @@
                                 <m:r>
                                   <w:rPr>
                                     <w:rFonts w:ascii="Cambria Math" w:hAnsi="Cambria Math"/>
-                                    <w:sz w:val="18"/>
+                                    <w:sz w:val="20"/>
+                                    <w:szCs w:val="28"/>
                                   </w:rPr>
                                   <m:t>ds</m:t>
                                 </m:r>
@@ -842,37 +893,42 @@
                     </w:txbxContent>
                   </v:textbox>
                 </v:shape>
-                <v:shape id="Text Box 9" o:spid="_x0000_s1033" type="#_x0000_t202" style="position:absolute;left:15708;top:3868;width:2280;height:2597;visibility:visible;mso-wrap-style:square;v-text-anchor:top" o:gfxdata="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" filled="f" stroked="f">
+                <v:shape id="Text Box 9" o:spid="_x0000_s1033" type="#_x0000_t202" style="position:absolute;left:15708;top:3868;width:2280;height:2597;visibility:visible;mso-wrap-style:square;v-text-anchor:top" o:gfxdata="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" filled="f" stroked="f">
                   <v:textbox>
                     <w:txbxContent>
                       <w:p>
                         <w:pPr>
                           <w:rPr>
                             <w:i/>
-                            <w:sz w:val="18"/>
+                            <w:sz w:val="20"/>
+                            <w:szCs w:val="28"/>
                           </w:rPr>
                         </w:pPr>
-                        <w:proofErr w:type="gramStart"/>
-                        <w:r>
-                          <w:rPr>
-                            <w:i/>
-                            <w:sz w:val="18"/>
-                          </w:rPr>
-                          <w:t>y</w:t>
-                        </w:r>
-                        <w:proofErr w:type="gramEnd"/>
+                        <m:oMathPara>
+                          <m:oMath>
+                            <m:r>
+                              <w:rPr>
+                                <w:rFonts w:ascii="Cambria Math" w:hAnsi="Cambria Math"/>
+                                <w:sz w:val="20"/>
+                                <w:szCs w:val="28"/>
+                              </w:rPr>
+                              <m:t>y</m:t>
+                            </m:r>
+                          </m:oMath>
+                        </m:oMathPara>
                       </w:p>
                     </w:txbxContent>
                   </v:textbox>
                 </v:shape>
-                <v:shape id="Text Box 9" o:spid="_x0000_s1034" type="#_x0000_t202" style="position:absolute;left:26494;top:5099;width:3569;height:2576;visibility:visible;mso-wrap-style:square;v-text-anchor:top" o:gfxdata="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" filled="f" stroked="f">
+                <v:shape id="Text Box 9" o:spid="_x0000_s1034" type="#_x0000_t202" style="position:absolute;left:26494;top:5099;width:3569;height:2576;visibility:visible;mso-wrap-style:square;v-text-anchor:top" o:gfxdata="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" filled="f" stroked="f">
                   <v:textbox>
                     <w:txbxContent>
                       <w:p>
                         <w:pPr>
                           <w:rPr>
                             <w:i/>
-                            <w:sz w:val="18"/>
+                            <w:sz w:val="20"/>
+                            <w:szCs w:val="28"/>
                           </w:rPr>
                         </w:pPr>
                         <m:oMathPara>
@@ -883,7 +939,8 @@
                                   <w:rPr>
                                     <w:rFonts w:ascii="Cambria Math" w:hAnsi="Cambria Math"/>
                                     <w:i/>
-                                    <w:sz w:val="18"/>
+                                    <w:sz w:val="20"/>
+                                    <w:szCs w:val="28"/>
                                   </w:rPr>
                                 </m:ctrlPr>
                               </m:sSubPr>
@@ -891,16 +948,21 @@
                                 <m:r>
                                   <w:rPr>
                                     <w:rFonts w:ascii="Cambria Math" w:hAnsi="Cambria Math"/>
-                                    <w:sz w:val="18"/>
+                                    <w:sz w:val="20"/>
+                                    <w:szCs w:val="28"/>
                                   </w:rPr>
                                   <m:t>θ</m:t>
                                 </m:r>
                               </m:e>
                               <m:sub>
                                 <m:r>
+                                  <m:rPr>
+                                    <m:sty m:val="p"/>
+                                  </m:rPr>
                                   <w:rPr>
                                     <w:rFonts w:ascii="Cambria Math" w:hAnsi="Cambria Math"/>
-                                    <w:sz w:val="18"/>
+                                    <w:sz w:val="20"/>
+                                    <w:szCs w:val="28"/>
                                   </w:rPr>
                                   <m:t>out</m:t>
                                 </m:r>
@@ -912,14 +974,15 @@
                     </w:txbxContent>
                   </v:textbox>
                 </v:shape>
-                <v:shape id="Text Box 9" o:spid="_x0000_s1035" type="#_x0000_t202" style="position:absolute;left:23856;top:5978;width:2705;height:2401;visibility:visible;mso-wrap-style:square;v-text-anchor:top" o:gfxdata="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" filled="f" stroked="f">
+                <v:shape id="Text Box 9" o:spid="_x0000_s1035" type="#_x0000_t202" style="position:absolute;left:23856;top:5978;width:2705;height:2401;visibility:visible;mso-wrap-style:square;v-text-anchor:top" o:gfxdata="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" filled="f" stroked="f">
                   <v:textbox>
                     <w:txbxContent>
                       <w:p>
                         <w:pPr>
                           <w:rPr>
                             <w:i/>
-                            <w:sz w:val="18"/>
+                            <w:sz w:val="20"/>
+                            <w:szCs w:val="28"/>
                           </w:rPr>
                         </w:pPr>
                         <m:oMathPara>
@@ -930,7 +993,8 @@
                                   <w:rPr>
                                     <w:rFonts w:ascii="Cambria Math" w:hAnsi="Cambria Math"/>
                                     <w:i/>
-                                    <w:sz w:val="18"/>
+                                    <w:sz w:val="20"/>
+                                    <w:szCs w:val="28"/>
                                   </w:rPr>
                                 </m:ctrlPr>
                               </m:sSubPr>
@@ -938,16 +1002,21 @@
                                 <m:r>
                                   <w:rPr>
                                     <w:rFonts w:ascii="Cambria Math" w:hAnsi="Cambria Math"/>
-                                    <w:sz w:val="18"/>
+                                    <w:sz w:val="20"/>
+                                    <w:szCs w:val="28"/>
                                   </w:rPr>
                                   <m:t>θ</m:t>
                                 </m:r>
                               </m:e>
                               <m:sub>
                                 <m:r>
+                                  <m:rPr>
+                                    <m:sty m:val="p"/>
+                                  </m:rPr>
                                   <w:rPr>
                                     <w:rFonts w:ascii="Cambria Math" w:hAnsi="Cambria Math"/>
-                                    <w:sz w:val="18"/>
+                                    <w:sz w:val="20"/>
+                                    <w:szCs w:val="28"/>
                                   </w:rPr>
                                   <m:t>in</m:t>
                                 </m:r>
@@ -959,17 +1028,17 @@
                     </w:txbxContent>
                   </v:textbox>
                 </v:shape>
-                <v:oval id="Oval 18" o:spid="_x0000_s1036" style="position:absolute;left:17408;top:1406;width:546;height:546;visibility:visible;mso-wrap-style:square;v-text-anchor:middle" o:gfxdata="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" fillcolor="black [3213]" stroked="f" strokeweight="2pt"/>
-                <v:shape id="Straight Arrow Connector 69" o:spid="_x0000_s1037" type="#_x0000_t32" style="position:absolute;left:17874;top:1872;width:9700;height:5789;flip:x y;visibility:visible;mso-wrap-style:square" o:connectortype="straight" o:gfxdata="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" strokecolor="black [3213]">
+                <v:oval id="Oval 18" o:spid="_x0000_s1036" style="position:absolute;left:17408;top:1406;width:546;height:546;visibility:visible;mso-wrap-style:square;v-text-anchor:middle" o:gfxdata="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" fillcolor="black [3213]" stroked="f" strokeweight="2pt"/>
+                <v:shape id="Straight Arrow Connector 69" o:spid="_x0000_s1037" type="#_x0000_t32" style="position:absolute;left:17874;top:1872;width:9700;height:5789;flip:x y;visibility:visible;mso-wrap-style:square" o:connectortype="straight" o:gfxdata="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" strokecolor="black [3213]">
                   <v:stroke dashstyle="dash"/>
                 </v:shape>
-                <v:shape id="Straight Arrow Connector 24" o:spid="_x0000_s1038" type="#_x0000_t32" style="position:absolute;left:26611;top:7971;width:2578;height:0;flip:x;visibility:visible;mso-wrap-style:square" o:connectortype="straight" o:gfxdata="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" strokecolor="black [3213]" strokeweight="2.25pt">
+                <v:shape id="Straight Arrow Connector 24" o:spid="_x0000_s1038" type="#_x0000_t32" style="position:absolute;left:27077;top:7971;width:1828;height:0;flip:x;visibility:visible;mso-wrap-style:square" o:connectortype="straight" o:gfxdata="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" strokecolor="black [3213]" strokeweight="1.5pt">
                   <v:stroke startarrow="open" startarrowwidth="narrow" startarrowlength="short"/>
                 </v:shape>
-                <v:shape id="Straight Arrow Connector 25" o:spid="_x0000_s1039" type="#_x0000_t32" style="position:absolute;left:17670;top:1751;width:0;height:6220;flip:y;visibility:visible;mso-wrap-style:square" o:connectortype="straight" o:gfxdata="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" strokecolor="black [3213]">
+                <v:shape id="Straight Arrow Connector 25" o:spid="_x0000_s1039" type="#_x0000_t32" style="position:absolute;left:17670;top:1751;width:0;height:6220;flip:y;visibility:visible;mso-wrap-style:square" o:connectortype="straight" o:gfxdata="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" strokecolor="black [3213]">
                   <v:stroke dashstyle="dash"/>
                 </v:shape>
-                <v:shape id="Arc 81" o:spid="_x0000_s1040" style="position:absolute;left:24794;top:5099;width:6102;height:6102;visibility:visible;mso-wrap-style:square;v-text-anchor:middle" coordsize="610235,610235" o:gfxdata="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" path="m72056,108193nsc154340,10810,288497,-25147,408454,18031,528411,61209,608876,174419,610219,301904r-305101,3214l72056,108193xem72056,108193nfc154340,10810,288497,-25147,408454,18031,528411,61209,608876,174419,610219,301904e" filled="f" strokecolor="black [3213]">
+                <v:shape id="Arc 81" o:spid="_x0000_s1040" style="position:absolute;left:24794;top:5099;width:6102;height:6102;visibility:visible;mso-wrap-style:square;v-text-anchor:middle" coordsize="610235,610235" o:gfxdata="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" path="m72056,108193nsc154340,10810,288497,-25147,408454,18031,528411,61209,608876,174419,610219,301904r-305101,3214l72056,108193xem72056,108193nfc154340,10810,288497,-25147,408454,18031,528411,61209,608876,174419,610219,301904e" filled="f" strokecolor="black [3213]">
                   <v:stroke dashstyle="3 1"/>
                   <v:path arrowok="t" o:connecttype="custom" o:connectlocs="72056,108193;408454,18031;610219,301904" o:connectangles="0,0,0"/>
                 </v:shape>
@@ -978,7 +1047,6 @@
           </mc:Fallback>
         </mc:AlternateContent>
       </w:r>
-      <w:bookmarkEnd w:id="0"/>
     </w:p>
     <w:sectPr>
       <w:pgSz w:w="12240" w:h="15840"/>
@@ -991,7 +1059,7 @@
 </file>
 
 <file path=word/styles.xml><?xml version="1.0" encoding="utf-8"?>
-<w:styles xmlns:mc="http://schemas.openxmlformats.org/markup-compatibility/2006" xmlns:r="http://schemas.openxmlformats.org/officeDocument/2006/relationships" xmlns:w="http://schemas.openxmlformats.org/wordprocessingml/2006/main" xmlns:w14="http://schemas.microsoft.com/office/word/2010/wordml" mc:Ignorable="w14">
+<w:styles xmlns:mc="http://schemas.openxmlformats.org/markup-compatibility/2006" xmlns:r="http://schemas.openxmlformats.org/officeDocument/2006/relationships" xmlns:w="http://schemas.openxmlformats.org/wordprocessingml/2006/main" xmlns:w14="http://schemas.microsoft.com/office/word/2010/wordml" xmlns:w15="http://schemas.microsoft.com/office/word/2012/wordml" xmlns:w16cex="http://schemas.microsoft.com/office/word/2018/wordml/cex" xmlns:w16cid="http://schemas.microsoft.com/office/word/2016/wordml/cid" xmlns:w16="http://schemas.microsoft.com/office/word/2018/wordml" xmlns:w16du="http://schemas.microsoft.com/office/word/2023/wordml/word16du" xmlns:w16sdtdh="http://schemas.microsoft.com/office/word/2020/wordml/sdtdatahash" xmlns:w16sdtfl="http://schemas.microsoft.com/office/word/2024/wordml/sdtformatlock" xmlns:w16se="http://schemas.microsoft.com/office/word/2015/wordml/symex" mc:Ignorable="w14 w15 w16se w16cid w16 w16cex w16sdtdh w16sdtfl w16du">
   <w:docDefaults>
     <w:rPrDefault>
       <w:rPr>
@@ -1007,370 +1075,383 @@
       </w:pPr>
     </w:pPrDefault>
   </w:docDefaults>
-  <w:latentStyles w:defLockedState="0" w:defUIPriority="99" w:defSemiHidden="1" w:defUnhideWhenUsed="1" w:defQFormat="0" w:count="267">
-    <w:lsdException w:name="Normal" w:semiHidden="0" w:uiPriority="0" w:unhideWhenUsed="0" w:qFormat="1"/>
-    <w:lsdException w:name="heading 1" w:semiHidden="0" w:uiPriority="9" w:unhideWhenUsed="0" w:qFormat="1"/>
-    <w:lsdException w:name="heading 2" w:uiPriority="9" w:qFormat="1"/>
-    <w:lsdException w:name="heading 3" w:uiPriority="9" w:qFormat="1"/>
-    <w:lsdException w:name="heading 4" w:uiPriority="9" w:qFormat="1"/>
-    <w:lsdException w:name="heading 5" w:uiPriority="9" w:qFormat="1"/>
-    <w:lsdException w:name="heading 6" w:uiPriority="9" w:qFormat="1"/>
-    <w:lsdException w:name="heading 7" w:uiPriority="9" w:qFormat="1"/>
-    <w:lsdException w:name="heading 8" w:uiPriority="9" w:qFormat="1"/>
-    <w:lsdException w:name="heading 9" w:uiPriority="9" w:qFormat="1"/>
-    <w:lsdException w:name="toc 1" w:uiPriority="39"/>
-    <w:lsdException w:name="toc 2" w:uiPriority="39"/>
-    <w:lsdException w:name="toc 3" w:uiPriority="39"/>
-    <w:lsdException w:name="toc 4" w:uiPriority="39"/>
-    <w:lsdException w:name="toc 5" w:uiPriority="39"/>
-    <w:lsdException w:name="toc 6" w:uiPriority="39"/>
-    <w:lsdException w:name="toc 7" w:uiPriority="39"/>
-    <w:lsdException w:name="toc 8" w:uiPriority="39"/>
-    <w:lsdException w:name="toc 9" w:uiPriority="39"/>
-    <w:lsdException w:name="caption" w:uiPriority="35" w:qFormat="1"/>
-    <w:lsdException w:name="Title" w:semiHidden="0" w:uiPriority="10" w:unhideWhenUsed="0" w:qFormat="1"/>
-    <w:lsdException w:name="Default Paragraph Font" w:uiPriority="1"/>
-    <w:lsdException w:name="Subtitle" w:semiHidden="0" w:uiPriority="11" w:unhideWhenUsed="0" w:qFormat="1"/>
-    <w:lsdException w:name="Strong" w:semiHidden="0" w:uiPriority="22" w:unhideWhenUsed="0" w:qFormat="1"/>
-    <w:lsdException w:name="Emphasis" w:semiHidden="0" w:uiPriority="20" w:unhideWhenUsed="0" w:qFormat="1"/>
-    <w:lsdException w:name="Table Grid" w:semiHidden="0" w:uiPriority="59" w:unhideWhenUsed="0"/>
-    <w:lsdException w:name="Placeholder Text" w:unhideWhenUsed="0"/>
-    <w:lsdException w:name="No Spacing" w:semiHidden="0" w:uiPriority="1" w:unhideWhenUsed="0" w:qFormat="1"/>
-    <w:lsdException w:name="Light Shading" w:semiHidden="0" w:uiPriority="60" w:unhideWhenUsed="0"/>
-    <w:lsdException w:name="Light List" w:semiHidden="0" w:uiPriority="61" w:unhideWhenUsed="0"/>
-    <w:lsdException w:name="Light Grid" w:semiHidden="0" w:uiPriority="62" w:unhideWhenUsed="0"/>
-    <w:lsdException w:name="Medium Shading 1" w:semiHidden="0" w:uiPriority="63" w:unhideWhenUsed="0"/>
-    <w:lsdException w:name="Medium Shading 2" w:semiHidden="0" w:uiPriority="64" w:unhideWhenUsed="0"/>
-    <w:lsdException w:name="Medium List 1" w:semiHidden="0" w:uiPriority="65" w:unhideWhenUsed="0"/>
-    <w:lsdException w:name="Medium List 2" w:semiHidden="0" w:uiPriority="66" w:unhideWhenUsed="0"/>
-    <w:lsdException w:name="Medium Grid 1" w:semiHidden="0" w:uiPriority="67" w:unhideWhenUsed="0"/>
-    <w:lsdException w:name="Medium Grid 2" w:semiHidden="0" w:uiPriority="68" w:unhideWhenUsed="0"/>
-    <w:lsdException w:name="Medium Grid 3" w:semiHidden="0" w:uiPriority="69" w:unhideWhenUsed="0"/>
-    <w:lsdException w:name="Dark List" w:semiHidden="0" w:uiPriority="70" w:unhideWhenUsed="0"/>
-    <w:lsdException w:name="Colorful Shading" w:semiHidden="0" w:uiPriority="71" w:unhideWhenUsed="0"/>
-    <w:lsdException w:name="Colorful List" w:semiHidden="0" w:uiPriority="72" w:unhideWhenUsed="0"/>
-    <w:lsdException w:name="Colorful Grid" w:semiHidden="0" w:uiPriority="73" w:unhideWhenUsed="0"/>
-    <w:lsdException w:name="Light Shading Accent 1" w:semiHidden="0" w:uiPriority="60" w:unhideWhenUsed="0"/>
-    <w:lsdException w:name="Light List Accent 1" w:semiHidden="0" w:uiPriority="61" w:unhideWhenUsed="0"/>
-    <w:lsdException w:name="Light Grid Accent 1" w:semiHidden="0" w:uiPriority="62" w:unhideWhenUsed="0"/>
-    <w:lsdException w:name="Medium Shading 1 Accent 1" w:semiHidden="0" w:uiPriority="63" w:unhideWhenUsed="0"/>
-    <w:lsdException w:name="Medium Shading 2 Accent 1" w:semiHidden="0" w:uiPriority="64" w:unhideWhenUsed="0"/>
-    <w:lsdException w:name="Medium List 1 Accent 1" w:semiHidden="0" w:uiPriority="65" w:unhideWhenUsed="0"/>
-    <w:lsdException w:name="Revision" w:unhideWhenUsed="0"/>
-    <w:lsdException w:name="List Paragraph" w:semiHidden="0" w:uiPriority="34" w:unhideWhenUsed="0" w:qFormat="1"/>
-    <w:lsdException w:name="Quote" w:semiHidden="0" w:uiPriority="29" w:unhideWhenUsed="0" w:qFormat="1"/>
-    <w:lsdException w:name="Intense Quote" w:semiHidden="0" w:uiPriority="30" w:unhideWhenUsed="0" w:qFormat="1"/>
-    <w:lsdException w:name="Medium List 2 Accent 1" w:semiHidden="0" w:uiPriority="66" w:unhideWhenUsed="0"/>
-    <w:lsdException w:name="Medium Grid 1 Accent 1" w:semiHidden="0" w:uiPriority="67" w:unhideWhenUsed="0"/>
-    <w:lsdException w:name="Medium Grid 2 Accent 1" w:semiHidden="0" w:uiPriority="68" w:unhideWhenUsed="0"/>
-    <w:lsdException w:name="Medium Grid 3 Accent 1" w:semiHidden="0" w:uiPriority="69" w:unhideWhenUsed="0"/>
-    <w:lsdException w:name="Dark List Accent 1" w:semiHidden="0" w:uiPriority="70" w:unhideWhenUsed="0"/>
-    <w:lsdException w:name="Colorful Shading Accent 1" w:semiHidden="0" w:uiPriority="71" w:unhideWhenUsed="0"/>
-    <w:lsdException w:name="Colorful List Accent 1" w:semiHidden="0" w:uiPriority="72" w:unhideWhenUsed="0"/>
-    <w:lsdException w:name="Colorful Grid Accent 1" w:semiHidden="0" w:uiPriority="73" w:unhideWhenUsed="0"/>
-    <w:lsdException w:name="Light Shading Accent 2" w:semiHidden="0" w:uiPriority="60" w:unhideWhenUsed="0"/>
-    <w:lsdException w:name="Light List Accent 2" w:semiHidden="0" w:uiPriority="61" w:unhideWhenUsed="0"/>
-    <w:lsdException w:name="Light Grid Accent 2" w:semiHidden="0" w:uiPriority="62" w:unhideWhenUsed="0"/>
-    <w:lsdException w:name="Medium Shading 1 Accent 2" w:semiHidden="0" w:uiPriority="63" w:unhideWhenUsed="0"/>
-    <w:lsdException w:name="Medium Shading 2 Accent 2" w:semiHidden="0" w:uiPriority="64" w:unhideWhenUsed="0"/>
-    <w:lsdException w:name="Medium List 1 Accent 2" w:semiHidden="0" w:uiPriority="65" w:unhideWhenUsed="0"/>
-    <w:lsdException w:name="Medium List 2 Accent 2" w:semiHidden="0" w:uiPriority="66" w:unhideWhenUsed="0"/>
-    <w:lsdException w:name="Medium Grid 1 Accent 2" w:semiHidden="0" w:uiPriority="67" w:unhideWhenUsed="0"/>
-    <w:lsdException w:name="Medium Grid 2 Accent 2" w:semiHidden="0" w:uiPriority="68" w:unhideWhenUsed="0"/>
-    <w:lsdException w:name="Medium Grid 3 Accent 2" w:semiHidden="0" w:uiPriority="69" w:unhideWhenUsed="0"/>
-    <w:lsdException w:name="Dark List Accent 2" w:semiHidden="0" w:uiPriority="70" w:unhideWhenUsed="0"/>
-    <w:lsdException w:name="Colorful Shading Accent 2" w:semiHidden="0" w:uiPriority="71" w:unhideWhenUsed="0"/>
-    <w:lsdException w:name="Colorful List Accent 2" w:semiHidden="0" w:uiPriority="72" w:unhideWhenUsed="0"/>
-    <w:lsdException w:name="Colorful Grid Accent 2" w:semiHidden="0" w:uiPriority="73" w:unhideWhenUsed="0"/>
-    <w:lsdException w:name="Light Shading Accent 3" w:semiHidden="0" w:uiPriority="60" w:unhideWhenUsed="0"/>
-    <w:lsdException w:name="Light List Accent 3" w:semiHidden="0" w:uiPriority="61" w:unhideWhenUsed="0"/>
-    <w:lsdException w:name="Light Grid Accent 3" w:semiHidden="0" w:uiPriority="62" w:unhideWhenUsed="0"/>
-    <w:lsdException w:name="Medium Shading 1 Accent 3" w:semiHidden="0" w:uiPriority="63" w:unhideWhenUsed="0"/>
-    <w:lsdException w:name="Medium Shading 2 Accent 3" w:semiHidden="0" w:uiPriority="64" w:unhideWhenUsed="0"/>
-    <w:lsdException w:name="Medium List 1 Accent 3" w:semiHidden="0" w:uiPriority="65" w:unhideWhenUsed="0"/>
-    <w:lsdException w:name="Medium List 2 Accent 3" w:semiHidden="0" w:uiPriority="66" w:unhideWhenUsed="0"/>
-    <w:lsdException w:name="Medium Grid 1 Accent 3" w:semiHidden="0" w:uiPriority="67" w:unhideWhenUsed="0"/>
-    <w:lsdException w:name="Medium Grid 2 Accent 3" w:semiHidden="0" w:uiPriority="68" w:unhideWhenUsed="0"/>
-    <w:lsdException w:name="Medium Grid 3 Accent 3" w:semiHidden="0" w:uiPriority="69" w:unhideWhenUsed="0"/>
-    <w:lsdException w:name="Dark List Accent 3" w:semiHidden="0" w:uiPriority="70" w:unhideWhenUsed="0"/>
-    <w:lsdException w:name="Colorful Shading Accent 3" w:semiHidden="0" w:uiPriority="71" w:unhideWhenUsed="0"/>
-    <w:lsdException w:name="Colorful List Accent 3" w:semiHidden="0" w:uiPriority="72" w:unhideWhenUsed="0"/>
-    <w:lsdException w:name="Colorful Grid Accent 3" w:semiHidden="0" w:uiPriority="73" w:unhideWhenUsed="0"/>
-    <w:lsdException w:name="Light Shading Accent 4" w:semiHidden="0" w:uiPriority="60" w:unhideWhenUsed="0"/>
-    <w:lsdException w:name="Light List Accent 4" w:semiHidden="0" w:uiPriority="61" w:unhideWhenUsed="0"/>
-    <w:lsdException w:name="Light Grid Accent 4" w:semiHidden="0" w:uiPriority="62" w:unhideWhenUsed="0"/>
-    <w:lsdException w:name="Medium Shading 1 Accent 4" w:semiHidden="0" w:uiPriority="63" w:unhideWhenUsed="0"/>
-    <w:lsdException w:name="Medium Shading 2 Accent 4" w:semiHidden="0" w:uiPriority="64" w:unhideWhenUsed="0"/>
-    <w:lsdException w:name="Medium List 1 Accent 4" w:semiHidden="0" w:uiPriority="65" w:unhideWhenUsed="0"/>
-    <w:lsdException w:name="Medium List 2 Accent 4" w:semiHidden="0" w:uiPriority="66" w:unhideWhenUsed="0"/>
-    <w:lsdException w:name="Medium Grid 1 Accent 4" w:semiHidden="0" w:uiPriority="67" w:unhideWhenUsed="0"/>
-    <w:lsdException w:name="Medium Grid 2 Accent 4" w:semiHidden="0" w:uiPriority="68" w:unhideWhenUsed="0"/>
-    <w:lsdException w:name="Medium Grid 3 Accent 4" w:semiHidden="0" w:uiPriority="69" w:unhideWhenUsed="0"/>
-    <w:lsdException w:name="Dark List Accent 4" w:semiHidden="0" w:uiPriority="70" w:unhideWhenUsed="0"/>
-    <w:lsdException w:name="Colorful Shading Accent 4" w:semiHidden="0" w:uiPriority="71" w:unhideWhenUsed="0"/>
-    <w:lsdException w:name="Colorful List Accent 4" w:semiHidden="0" w:uiPriority="72" w:unhideWhenUsed="0"/>
-    <w:lsdException w:name="Colorful Grid Accent 4" w:semiHidden="0" w:uiPriority="73" w:unhideWhenUsed="0"/>
-    <w:lsdException w:name="Light Shading Accent 5" w:semiHidden="0" w:uiPriority="60" w:unhideWhenUsed="0"/>
-    <w:lsdException w:name="Light List Accent 5" w:semiHidden="0" w:uiPriority="61" w:unhideWhenUsed="0"/>
-    <w:lsdException w:name="Light Grid Accent 5" w:semiHidden="0" w:uiPriority="62" w:unhideWhenUsed="0"/>
-    <w:lsdException w:name="Medium Shading 1 Accent 5" w:semiHidden="0" w:uiPriority="63" w:unhideWhenUsed="0"/>
-    <w:lsdException w:name="Medium Shading 2 Accent 5" w:semiHidden="0" w:uiPriority="64" w:unhideWhenUsed="0"/>
-    <w:lsdException w:name="Medium List 1 Accent 5" w:semiHidden="0" w:uiPriority="65" w:unhideWhenUsed="0"/>
-    <w:lsdException w:name="Medium List 2 Accent 5" w:semiHidden="0" w:uiPriority="66" w:unhideWhenUsed="0"/>
-    <w:lsdException w:name="Medium Grid 1 Accent 5" w:semiHidden="0" w:uiPriority="67" w:unhideWhenUsed="0"/>
-    <w:lsdException w:name="Medium Grid 2 Accent 5" w:semiHidden="0" w:uiPriority="68" w:unhideWhenUsed="0"/>
-    <w:lsdException w:name="Medium Grid 3 Accent 5" w:semiHidden="0" w:uiPriority="69" w:unhideWhenUsed="0"/>
-    <w:lsdException w:name="Dark List Accent 5" w:semiHidden="0" w:uiPriority="70" w:unhideWhenUsed="0"/>
-    <w:lsdException w:name="Colorful Shading Accent 5" w:semiHidden="0" w:uiPriority="71" w:unhideWhenUsed="0"/>
-    <w:lsdException w:name="Colorful List Accent 5" w:semiHidden="0" w:uiPriority="72" w:unhideWhenUsed="0"/>
-    <w:lsdException w:name="Colorful Grid Accent 5" w:semiHidden="0" w:uiPriority="73" w:unhideWhenUsed="0"/>
-    <w:lsdException w:name="Light Shading Accent 6" w:semiHidden="0" w:uiPriority="60" w:unhideWhenUsed="0"/>
-    <w:lsdException w:name="Light List Accent 6" w:semiHidden="0" w:uiPriority="61" w:unhideWhenUsed="0"/>
-    <w:lsdException w:name="Light Grid Accent 6" w:semiHidden="0" w:uiPriority="62" w:unhideWhenUsed="0"/>
-    <w:lsdException w:name="Medium Shading 1 Accent 6" w:semiHidden="0" w:uiPriority="63" w:unhideWhenUsed="0"/>
-    <w:lsdException w:name="Medium Shading 2 Accent 6" w:semiHidden="0" w:uiPriority="64" w:unhideWhenUsed="0"/>
-    <w:lsdException w:name="Medium List 1 Accent 6" w:semiHidden="0" w:uiPriority="65" w:unhideWhenUsed="0"/>
-    <w:lsdException w:name="Medium List 2 Accent 6" w:semiHidden="0" w:uiPriority="66" w:unhideWhenUsed="0"/>
-    <w:lsdException w:name="Medium Grid 1 Accent 6" w:semiHidden="0" w:uiPriority="67" w:unhideWhenUsed="0"/>
-    <w:lsdException w:name="Medium Grid 2 Accent 6" w:semiHidden="0" w:uiPriority="68" w:unhideWhenUsed="0"/>
-    <w:lsdException w:name="Medium Grid 3 Accent 6" w:semiHidden="0" w:uiPriority="69" w:unhideWhenUsed="0"/>
-    <w:lsdException w:name="Dark List Accent 6" w:semiHidden="0" w:uiPriority="70" w:unhideWhenUsed="0"/>
-    <w:lsdException w:name="Colorful Shading Accent 6" w:semiHidden="0" w:uiPriority="71" w:unhideWhenUsed="0"/>
-    <w:lsdException w:name="Colorful List Accent 6" w:semiHidden="0" w:uiPriority="72" w:unhideWhenUsed="0"/>
-    <w:lsdException w:name="Colorful Grid Accent 6" w:semiHidden="0" w:uiPriority="73" w:unhideWhenUsed="0"/>
-    <w:lsdException w:name="Subtle Emphasis" w:semiHidden="0" w:uiPriority="19" w:unhideWhenUsed="0" w:qFormat="1"/>
-    <w:lsdException w:name="Intense Emphasis" w:semiHidden="0" w:uiPriority="21" w:unhideWhenUsed="0" w:qFormat="1"/>
-    <w:lsdException w:name="Subtle Reference" w:semiHidden="0" w:uiPriority="31" w:unhideWhenUsed="0" w:qFormat="1"/>
-    <w:lsdException w:name="Intense Reference" w:semiHidden="0" w:uiPriority="32" w:unhideWhenUsed="0" w:qFormat="1"/>
-    <w:lsdException w:name="Book Title" w:semiHidden="0" w:uiPriority="33" w:unhideWhenUsed="0" w:qFormat="1"/>
-    <w:lsdException w:name="Bibliography" w:uiPriority="37"/>
-    <w:lsdException w:name="TOC Heading" w:uiPriority="39" w:qFormat="1"/>
-  </w:latentStyles>
-  <w:style w:type="paragraph" w:default="1" w:styleId="Normal">
-    <w:name w:val="Normal"/>
-    <w:qFormat/>
-    <w:rsid w:val="00174C40"/>
-    <w:pPr>
-      <w:spacing w:after="0" w:line="240" w:lineRule="auto"/>
-    </w:pPr>
-    <w:rPr>
-      <w:rFonts w:ascii="Times New Roman" w:eastAsia="Times New Roman" w:hAnsi="Times New Roman" w:cs="Times New Roman"/>
-      <w:sz w:val="24"/>
-      <w:szCs w:val="24"/>
-    </w:rPr>
-  </w:style>
-  <w:style w:type="character" w:default="1" w:styleId="DefaultParagraphFont">
-    <w:name w:val="Default Paragraph Font"/>
-    <w:uiPriority w:val="1"/>
-    <w:semiHidden/>
-    <w:unhideWhenUsed/>
-  </w:style>
-  <w:style w:type="table" w:default="1" w:styleId="TableNormal">
-    <w:name w:val="Normal Table"/>
-    <w:uiPriority w:val="99"/>
-    <w:semiHidden/>
-    <w:unhideWhenUsed/>
-    <w:tblPr>
-      <w:tblInd w:w="0" w:type="dxa"/>
-      <w:tblCellMar>
-        <w:top w:w="0" w:type="dxa"/>
-        <w:left w:w="108" w:type="dxa"/>
-        <w:bottom w:w="0" w:type="dxa"/>
-        <w:right w:w="108" w:type="dxa"/>
-      </w:tblCellMar>
-    </w:tblPr>
-  </w:style>
-  <w:style w:type="numbering" w:default="1" w:styleId="NoList">
-    <w:name w:val="No List"/>
-    <w:uiPriority w:val="99"/>
-    <w:semiHidden/>
-    <w:unhideWhenUsed/>
-  </w:style>
-  <w:style w:type="paragraph" w:styleId="BalloonText">
-    <w:name w:val="Balloon Text"/>
-    <w:basedOn w:val="Normal"/>
-    <w:link w:val="BalloonTextChar"/>
-    <w:uiPriority w:val="99"/>
-    <w:semiHidden/>
-    <w:unhideWhenUsed/>
-    <w:rsid w:val="00174C40"/>
-    <w:rPr>
-      <w:rFonts w:ascii="Tahoma" w:hAnsi="Tahoma" w:cs="Tahoma"/>
-      <w:sz w:val="16"/>
-      <w:szCs w:val="16"/>
-    </w:rPr>
-  </w:style>
-  <w:style w:type="character" w:customStyle="1" w:styleId="BalloonTextChar">
-    <w:name w:val="Balloon Text Char"/>
-    <w:basedOn w:val="DefaultParagraphFont"/>
-    <w:link w:val="BalloonText"/>
-    <w:uiPriority w:val="99"/>
-    <w:semiHidden/>
-    <w:rsid w:val="00174C40"/>
-    <w:rPr>
-      <w:rFonts w:ascii="Tahoma" w:eastAsia="Times New Roman" w:hAnsi="Tahoma" w:cs="Tahoma"/>
-      <w:sz w:val="16"/>
-      <w:szCs w:val="16"/>
-    </w:rPr>
-  </w:style>
-</w:styles>
-</file>
-
-<file path=word/stylesWithEffects.xml><?xml version="1.0" encoding="utf-8"?>
-<w:styles xmlns:wpc="http://schemas.microsoft.com/office/word/2010/wordprocessingCanvas" xmlns:mc="http://schemas.openxmlformats.org/markup-compatibility/2006" xmlns:o="urn:schemas-microsoft-com:office:office" xmlns:r="http://schemas.openxmlformats.org/officeDocument/2006/relationships" xmlns:m="http://schemas.openxmlformats.org/officeDocument/2006/math" xmlns:v="urn:schemas-microsoft-com:vml" xmlns:wp14="http://schemas.microsoft.com/office/word/2010/wordprocessingDrawing" xmlns:wp="http://schemas.openxmlformats.org/drawingml/2006/wordprocessingDrawing" xmlns:w10="urn:schemas-microsoft-com:office:word" xmlns:w="http://schemas.openxmlformats.org/wordprocessingml/2006/main" xmlns:w14="http://schemas.microsoft.com/office/word/2010/wordml" xmlns:wpg="http://schemas.microsoft.com/office/word/2010/wordprocessingGroup" xmlns:wpi="http://schemas.microsoft.com/office/word/2010/wordprocessingInk" xmlns:wne="http://schemas.microsoft.com/office/word/2006/wordml" xmlns:wps="http://schemas.microsoft.com/office/word/2010/wordprocessingShape" mc:Ignorable="w14 wp14">
-  <w:docDefaults>
-    <w:rPrDefault>
-      <w:rPr>
-        <w:rFonts w:asciiTheme="minorHAnsi" w:eastAsiaTheme="minorHAnsi" w:hAnsiTheme="minorHAnsi" w:cstheme="minorBidi"/>
-        <w:sz w:val="22"/>
-        <w:szCs w:val="22"/>
-        <w:lang w:val="en-US" w:eastAsia="en-US" w:bidi="ar-SA"/>
-      </w:rPr>
-    </w:rPrDefault>
-    <w:pPrDefault>
-      <w:pPr>
-        <w:spacing w:after="200" w:line="276" w:lineRule="auto"/>
-      </w:pPr>
-    </w:pPrDefault>
-  </w:docDefaults>
-  <w:latentStyles w:defLockedState="0" w:defUIPriority="99" w:defSemiHidden="1" w:defUnhideWhenUsed="1" w:defQFormat="0" w:count="267">
-    <w:lsdException w:name="Normal" w:semiHidden="0" w:uiPriority="0" w:unhideWhenUsed="0" w:qFormat="1"/>
-    <w:lsdException w:name="heading 1" w:semiHidden="0" w:uiPriority="9" w:unhideWhenUsed="0" w:qFormat="1"/>
-    <w:lsdException w:name="heading 2" w:uiPriority="9" w:qFormat="1"/>
-    <w:lsdException w:name="heading 3" w:uiPriority="9" w:qFormat="1"/>
-    <w:lsdException w:name="heading 4" w:uiPriority="9" w:qFormat="1"/>
-    <w:lsdException w:name="heading 5" w:uiPriority="9" w:qFormat="1"/>
-    <w:lsdException w:name="heading 6" w:uiPriority="9" w:qFormat="1"/>
-    <w:lsdException w:name="heading 7" w:uiPriority="9" w:qFormat="1"/>
-    <w:lsdException w:name="heading 8" w:uiPriority="9" w:qFormat="1"/>
-    <w:lsdException w:name="heading 9" w:uiPriority="9" w:qFormat="1"/>
-    <w:lsdException w:name="toc 1" w:uiPriority="39"/>
-    <w:lsdException w:name="toc 2" w:uiPriority="39"/>
-    <w:lsdException w:name="toc 3" w:uiPriority="39"/>
-    <w:lsdException w:name="toc 4" w:uiPriority="39"/>
-    <w:lsdException w:name="toc 5" w:uiPriority="39"/>
-    <w:lsdException w:name="toc 6" w:uiPriority="39"/>
-    <w:lsdException w:name="toc 7" w:uiPriority="39"/>
-    <w:lsdException w:name="toc 8" w:uiPriority="39"/>
-    <w:lsdException w:name="toc 9" w:uiPriority="39"/>
-    <w:lsdException w:name="caption" w:uiPriority="35" w:qFormat="1"/>
-    <w:lsdException w:name="Title" w:semiHidden="0" w:uiPriority="10" w:unhideWhenUsed="0" w:qFormat="1"/>
-    <w:lsdException w:name="Default Paragraph Font" w:uiPriority="1"/>
-    <w:lsdException w:name="Subtitle" w:semiHidden="0" w:uiPriority="11" w:unhideWhenUsed="0" w:qFormat="1"/>
-    <w:lsdException w:name="Strong" w:semiHidden="0" w:uiPriority="22" w:unhideWhenUsed="0" w:qFormat="1"/>
-    <w:lsdException w:name="Emphasis" w:semiHidden="0" w:uiPriority="20" w:unhideWhenUsed="0" w:qFormat="1"/>
-    <w:lsdException w:name="Table Grid" w:semiHidden="0" w:uiPriority="59" w:unhideWhenUsed="0"/>
-    <w:lsdException w:name="Placeholder Text" w:unhideWhenUsed="0"/>
-    <w:lsdException w:name="No Spacing" w:semiHidden="0" w:uiPriority="1" w:unhideWhenUsed="0" w:qFormat="1"/>
-    <w:lsdException w:name="Light Shading" w:semiHidden="0" w:uiPriority="60" w:unhideWhenUsed="0"/>
-    <w:lsdException w:name="Light List" w:semiHidden="0" w:uiPriority="61" w:unhideWhenUsed="0"/>
-    <w:lsdException w:name="Light Grid" w:semiHidden="0" w:uiPriority="62" w:unhideWhenUsed="0"/>
-    <w:lsdException w:name="Medium Shading 1" w:semiHidden="0" w:uiPriority="63" w:unhideWhenUsed="0"/>
-    <w:lsdException w:name="Medium Shading 2" w:semiHidden="0" w:uiPriority="64" w:unhideWhenUsed="0"/>
-    <w:lsdException w:name="Medium List 1" w:semiHidden="0" w:uiPriority="65" w:unhideWhenUsed="0"/>
-    <w:lsdException w:name="Medium List 2" w:semiHidden="0" w:uiPriority="66" w:unhideWhenUsed="0"/>
-    <w:lsdException w:name="Medium Grid 1" w:semiHidden="0" w:uiPriority="67" w:unhideWhenUsed="0"/>
-    <w:lsdException w:name="Medium Grid 2" w:semiHidden="0" w:uiPriority="68" w:unhideWhenUsed="0"/>
-    <w:lsdException w:name="Medium Grid 3" w:semiHidden="0" w:uiPriority="69" w:unhideWhenUsed="0"/>
-    <w:lsdException w:name="Dark List" w:semiHidden="0" w:uiPriority="70" w:unhideWhenUsed="0"/>
-    <w:lsdException w:name="Colorful Shading" w:semiHidden="0" w:uiPriority="71" w:unhideWhenUsed="0"/>
-    <w:lsdException w:name="Colorful List" w:semiHidden="0" w:uiPriority="72" w:unhideWhenUsed="0"/>
-    <w:lsdException w:name="Colorful Grid" w:semiHidden="0" w:uiPriority="73" w:unhideWhenUsed="0"/>
-    <w:lsdException w:name="Light Shading Accent 1" w:semiHidden="0" w:uiPriority="60" w:unhideWhenUsed="0"/>
-    <w:lsdException w:name="Light List Accent 1" w:semiHidden="0" w:uiPriority="61" w:unhideWhenUsed="0"/>
-    <w:lsdException w:name="Light Grid Accent 1" w:semiHidden="0" w:uiPriority="62" w:unhideWhenUsed="0"/>
-    <w:lsdException w:name="Medium Shading 1 Accent 1" w:semiHidden="0" w:uiPriority="63" w:unhideWhenUsed="0"/>
-    <w:lsdException w:name="Medium Shading 2 Accent 1" w:semiHidden="0" w:uiPriority="64" w:unhideWhenUsed="0"/>
-    <w:lsdException w:name="Medium List 1 Accent 1" w:semiHidden="0" w:uiPriority="65" w:unhideWhenUsed="0"/>
-    <w:lsdException w:name="Revision" w:unhideWhenUsed="0"/>
-    <w:lsdException w:name="List Paragraph" w:semiHidden="0" w:uiPriority="34" w:unhideWhenUsed="0" w:qFormat="1"/>
-    <w:lsdException w:name="Quote" w:semiHidden="0" w:uiPriority="29" w:unhideWhenUsed="0" w:qFormat="1"/>
-    <w:lsdException w:name="Intense Quote" w:semiHidden="0" w:uiPriority="30" w:unhideWhenUsed="0" w:qFormat="1"/>
-    <w:lsdException w:name="Medium List 2 Accent 1" w:semiHidden="0" w:uiPriority="66" w:unhideWhenUsed="0"/>
-    <w:lsdException w:name="Medium Grid 1 Accent 1" w:semiHidden="0" w:uiPriority="67" w:unhideWhenUsed="0"/>
-    <w:lsdException w:name="Medium Grid 2 Accent 1" w:semiHidden="0" w:uiPriority="68" w:unhideWhenUsed="0"/>
-    <w:lsdException w:name="Medium Grid 3 Accent 1" w:semiHidden="0" w:uiPriority="69" w:unhideWhenUsed="0"/>
-    <w:lsdException w:name="Dark List Accent 1" w:semiHidden="0" w:uiPriority="70" w:unhideWhenUsed="0"/>
-    <w:lsdException w:name="Colorful Shading Accent 1" w:semiHidden="0" w:uiPriority="71" w:unhideWhenUsed="0"/>
-    <w:lsdException w:name="Colorful List Accent 1" w:semiHidden="0" w:uiPriority="72" w:unhideWhenUsed="0"/>
-    <w:lsdException w:name="Colorful Grid Accent 1" w:semiHidden="0" w:uiPriority="73" w:unhideWhenUsed="0"/>
-    <w:lsdException w:name="Light Shading Accent 2" w:semiHidden="0" w:uiPriority="60" w:unhideWhenUsed="0"/>
-    <w:lsdException w:name="Light List Accent 2" w:semiHidden="0" w:uiPriority="61" w:unhideWhenUsed="0"/>
-    <w:lsdException w:name="Light Grid Accent 2" w:semiHidden="0" w:uiPriority="62" w:unhideWhenUsed="0"/>
-    <w:lsdException w:name="Medium Shading 1 Accent 2" w:semiHidden="0" w:uiPriority="63" w:unhideWhenUsed="0"/>
-    <w:lsdException w:name="Medium Shading 2 Accent 2" w:semiHidden="0" w:uiPriority="64" w:unhideWhenUsed="0"/>
-    <w:lsdException w:name="Medium List 1 Accent 2" w:semiHidden="0" w:uiPriority="65" w:unhideWhenUsed="0"/>
-    <w:lsdException w:name="Medium List 2 Accent 2" w:semiHidden="0" w:uiPriority="66" w:unhideWhenUsed="0"/>
-    <w:lsdException w:name="Medium Grid 1 Accent 2" w:semiHidden="0" w:uiPriority="67" w:unhideWhenUsed="0"/>
-    <w:lsdException w:name="Medium Grid 2 Accent 2" w:semiHidden="0" w:uiPriority="68" w:unhideWhenUsed="0"/>
-    <w:lsdException w:name="Medium Grid 3 Accent 2" w:semiHidden="0" w:uiPriority="69" w:unhideWhenUsed="0"/>
-    <w:lsdException w:name="Dark List Accent 2" w:semiHidden="0" w:uiPriority="70" w:unhideWhenUsed="0"/>
-    <w:lsdException w:name="Colorful Shading Accent 2" w:semiHidden="0" w:uiPriority="71" w:unhideWhenUsed="0"/>
-    <w:lsdException w:name="Colorful List Accent 2" w:semiHidden="0" w:uiPriority="72" w:unhideWhenUsed="0"/>
-    <w:lsdException w:name="Colorful Grid Accent 2" w:semiHidden="0" w:uiPriority="73" w:unhideWhenUsed="0"/>
-    <w:lsdException w:name="Light Shading Accent 3" w:semiHidden="0" w:uiPriority="60" w:unhideWhenUsed="0"/>
-    <w:lsdException w:name="Light List Accent 3" w:semiHidden="0" w:uiPriority="61" w:unhideWhenUsed="0"/>
-    <w:lsdException w:name="Light Grid Accent 3" w:semiHidden="0" w:uiPriority="62" w:unhideWhenUsed="0"/>
-    <w:lsdException w:name="Medium Shading 1 Accent 3" w:semiHidden="0" w:uiPriority="63" w:unhideWhenUsed="0"/>
-    <w:lsdException w:name="Medium Shading 2 Accent 3" w:semiHidden="0" w:uiPriority="64" w:unhideWhenUsed="0"/>
-    <w:lsdException w:name="Medium List 1 Accent 3" w:semiHidden="0" w:uiPriority="65" w:unhideWhenUsed="0"/>
-    <w:lsdException w:name="Medium List 2 Accent 3" w:semiHidden="0" w:uiPriority="66" w:unhideWhenUsed="0"/>
-    <w:lsdException w:name="Medium Grid 1 Accent 3" w:semiHidden="0" w:uiPriority="67" w:unhideWhenUsed="0"/>
-    <w:lsdException w:name="Medium Grid 2 Accent 3" w:semiHidden="0" w:uiPriority="68" w:unhideWhenUsed="0"/>
-    <w:lsdException w:name="Medium Grid 3 Accent 3" w:semiHidden="0" w:uiPriority="69" w:unhideWhenUsed="0"/>
-    <w:lsdException w:name="Dark List Accent 3" w:semiHidden="0" w:uiPriority="70" w:unhideWhenUsed="0"/>
-    <w:lsdException w:name="Colorful Shading Accent 3" w:semiHidden="0" w:uiPriority="71" w:unhideWhenUsed="0"/>
-    <w:lsdException w:name="Colorful List Accent 3" w:semiHidden="0" w:uiPriority="72" w:unhideWhenUsed="0"/>
-    <w:lsdException w:name="Colorful Grid Accent 3" w:semiHidden="0" w:uiPriority="73" w:unhideWhenUsed="0"/>
-    <w:lsdException w:name="Light Shading Accent 4" w:semiHidden="0" w:uiPriority="60" w:unhideWhenUsed="0"/>
-    <w:lsdException w:name="Light List Accent 4" w:semiHidden="0" w:uiPriority="61" w:unhideWhenUsed="0"/>
-    <w:lsdException w:name="Light Grid Accent 4" w:semiHidden="0" w:uiPriority="62" w:unhideWhenUsed="0"/>
-    <w:lsdException w:name="Medium Shading 1 Accent 4" w:semiHidden="0" w:uiPriority="63" w:unhideWhenUsed="0"/>
-    <w:lsdException w:name="Medium Shading 2 Accent 4" w:semiHidden="0" w:uiPriority="64" w:unhideWhenUsed="0"/>
-    <w:lsdException w:name="Medium List 1 Accent 4" w:semiHidden="0" w:uiPriority="65" w:unhideWhenUsed="0"/>
-    <w:lsdException w:name="Medium List 2 Accent 4" w:semiHidden="0" w:uiPriority="66" w:unhideWhenUsed="0"/>
-    <w:lsdException w:name="Medium Grid 1 Accent 4" w:semiHidden="0" w:uiPriority="67" w:unhideWhenUsed="0"/>
-    <w:lsdException w:name="Medium Grid 2 Accent 4" w:semiHidden="0" w:uiPriority="68" w:unhideWhenUsed="0"/>
-    <w:lsdException w:name="Medium Grid 3 Accent 4" w:semiHidden="0" w:uiPriority="69" w:unhideWhenUsed="0"/>
-    <w:lsdException w:name="Dark List Accent 4" w:semiHidden="0" w:uiPriority="70" w:unhideWhenUsed="0"/>
-    <w:lsdException w:name="Colorful Shading Accent 4" w:semiHidden="0" w:uiPriority="71" w:unhideWhenUsed="0"/>
-    <w:lsdException w:name="Colorful List Accent 4" w:semiHidden="0" w:uiPriority="72" w:unhideWhenUsed="0"/>
-    <w:lsdException w:name="Colorful Grid Accent 4" w:semiHidden="0" w:uiPriority="73" w:unhideWhenUsed="0"/>
-    <w:lsdException w:name="Light Shading Accent 5" w:semiHidden="0" w:uiPriority="60" w:unhideWhenUsed="0"/>
-    <w:lsdException w:name="Light List Accent 5" w:semiHidden="0" w:uiPriority="61" w:unhideWhenUsed="0"/>
-    <w:lsdException w:name="Light Grid Accent 5" w:semiHidden="0" w:uiPriority="62" w:unhideWhenUsed="0"/>
-    <w:lsdException w:name="Medium Shading 1 Accent 5" w:semiHidden="0" w:uiPriority="63" w:unhideWhenUsed="0"/>
-    <w:lsdException w:name="Medium Shading 2 Accent 5" w:semiHidden="0" w:uiPriority="64" w:unhideWhenUsed="0"/>
-    <w:lsdException w:name="Medium List 1 Accent 5" w:semiHidden="0" w:uiPriority="65" w:unhideWhenUsed="0"/>
-    <w:lsdException w:name="Medium List 2 Accent 5" w:semiHidden="0" w:uiPriority="66" w:unhideWhenUsed="0"/>
-    <w:lsdException w:name="Medium Grid 1 Accent 5" w:semiHidden="0" w:uiPriority="67" w:unhideWhenUsed="0"/>
-    <w:lsdException w:name="Medium Grid 2 Accent 5" w:semiHidden="0" w:uiPriority="68" w:unhideWhenUsed="0"/>
-    <w:lsdException w:name="Medium Grid 3 Accent 5" w:semiHidden="0" w:uiPriority="69" w:unhideWhenUsed="0"/>
-    <w:lsdException w:name="Dark List Accent 5" w:semiHidden="0" w:uiPriority="70" w:unhideWhenUsed="0"/>
-    <w:lsdException w:name="Colorful Shading Accent 5" w:semiHidden="0" w:uiPriority="71" w:unhideWhenUsed="0"/>
-    <w:lsdException w:name="Colorful List Accent 5" w:semiHidden="0" w:uiPriority="72" w:unhideWhenUsed="0"/>
-    <w:lsdException w:name="Colorful Grid Accent 5" w:semiHidden="0" w:uiPriority="73" w:unhideWhenUsed="0"/>
-    <w:lsdException w:name="Light Shading Accent 6" w:semiHidden="0" w:uiPriority="60" w:unhideWhenUsed="0"/>
-    <w:lsdException w:name="Light List Accent 6" w:semiHidden="0" w:uiPriority="61" w:unhideWhenUsed="0"/>
-    <w:lsdException w:name="Light Grid Accent 6" w:semiHidden="0" w:uiPriority="62" w:unhideWhenUsed="0"/>
-    <w:lsdException w:name="Medium Shading 1 Accent 6" w:semiHidden="0" w:uiPriority="63" w:unhideWhenUsed="0"/>
-    <w:lsdException w:name="Medium Shading 2 Accent 6" w:semiHidden="0" w:uiPriority="64" w:unhideWhenUsed="0"/>
-    <w:lsdException w:name="Medium List 1 Accent 6" w:semiHidden="0" w:uiPriority="65" w:unhideWhenUsed="0"/>
-    <w:lsdException w:name="Medium List 2 Accent 6" w:semiHidden="0" w:uiPriority="66" w:unhideWhenUsed="0"/>
-    <w:lsdException w:name="Medium Grid 1 Accent 6" w:semiHidden="0" w:uiPriority="67" w:unhideWhenUsed="0"/>
-    <w:lsdException w:name="Medium Grid 2 Accent 6" w:semiHidden="0" w:uiPriority="68" w:unhideWhenUsed="0"/>
-    <w:lsdException w:name="Medium Grid 3 Accent 6" w:semiHidden="0" w:uiPriority="69" w:unhideWhenUsed="0"/>
-    <w:lsdException w:name="Dark List Accent 6" w:semiHidden="0" w:uiPriority="70" w:unhideWhenUsed="0"/>
-    <w:lsdException w:name="Colorful Shading Accent 6" w:semiHidden="0" w:uiPriority="71" w:unhideWhenUsed="0"/>
-    <w:lsdException w:name="Colorful List Accent 6" w:semiHidden="0" w:uiPriority="72" w:unhideWhenUsed="0"/>
-    <w:lsdException w:name="Colorful Grid Accent 6" w:semiHidden="0" w:uiPriority="73" w:unhideWhenUsed="0"/>
-    <w:lsdException w:name="Subtle Emphasis" w:semiHidden="0" w:uiPriority="19" w:unhideWhenUsed="0" w:qFormat="1"/>
-    <w:lsdException w:name="Intense Emphasis" w:semiHidden="0" w:uiPriority="21" w:unhideWhenUsed="0" w:qFormat="1"/>
-    <w:lsdException w:name="Subtle Reference" w:semiHidden="0" w:uiPriority="31" w:unhideWhenUsed="0" w:qFormat="1"/>
-    <w:lsdException w:name="Intense Reference" w:semiHidden="0" w:uiPriority="32" w:unhideWhenUsed="0" w:qFormat="1"/>
-    <w:lsdException w:name="Book Title" w:semiHidden="0" w:uiPriority="33" w:unhideWhenUsed="0" w:qFormat="1"/>
-    <w:lsdException w:name="Bibliography" w:uiPriority="37"/>
-    <w:lsdException w:name="TOC Heading" w:uiPriority="39" w:qFormat="1"/>
+  <w:latentStyles w:defLockedState="0" w:defUIPriority="99" w:defSemiHidden="0" w:defUnhideWhenUsed="0" w:defQFormat="0" w:count="376">
+    <w:lsdException w:name="Normal" w:uiPriority="0" w:qFormat="1"/>
+    <w:lsdException w:name="heading 1" w:uiPriority="9" w:qFormat="1"/>
+    <w:lsdException w:name="heading 2" w:semiHidden="1" w:uiPriority="9" w:unhideWhenUsed="1" w:qFormat="1"/>
+    <w:lsdException w:name="heading 3" w:semiHidden="1" w:uiPriority="9" w:unhideWhenUsed="1" w:qFormat="1"/>
+    <w:lsdException w:name="heading 4" w:semiHidden="1" w:uiPriority="9" w:unhideWhenUsed="1" w:qFormat="1"/>
+    <w:lsdException w:name="heading 5" w:semiHidden="1" w:uiPriority="9" w:unhideWhenUsed="1" w:qFormat="1"/>
+    <w:lsdException w:name="heading 6" w:semiHidden="1" w:uiPriority="9" w:unhideWhenUsed="1" w:qFormat="1"/>
+    <w:lsdException w:name="heading 7" w:semiHidden="1" w:uiPriority="9" w:unhideWhenUsed="1" w:qFormat="1"/>
+    <w:lsdException w:name="heading 8" w:semiHidden="1" w:uiPriority="9" w:unhideWhenUsed="1" w:qFormat="1"/>
+    <w:lsdException w:name="heading 9" w:semiHidden="1" w:uiPriority="9" w:unhideWhenUsed="1" w:qFormat="1"/>
+    <w:lsdException w:name="index 1" w:semiHidden="1" w:unhideWhenUsed="1"/>
+    <w:lsdException w:name="index 2" w:semiHidden="1" w:unhideWhenUsed="1"/>
+    <w:lsdException w:name="index 3" w:semiHidden="1" w:unhideWhenUsed="1"/>
+    <w:lsdException w:name="index 4" w:semiHidden="1" w:unhideWhenUsed="1"/>
+    <w:lsdException w:name="index 5" w:semiHidden="1" w:unhideWhenUsed="1"/>
+    <w:lsdException w:name="index 6" w:semiHidden="1" w:unhideWhenUsed="1"/>
+    <w:lsdException w:name="index 7" w:semiHidden="1" w:unhideWhenUsed="1"/>
+    <w:lsdException w:name="index 8" w:semiHidden="1" w:unhideWhenUsed="1"/>
+    <w:lsdException w:name="index 9" w:semiHidden="1" w:unhideWhenUsed="1"/>
+    <w:lsdException w:name="toc 1" w:semiHidden="1" w:uiPriority="39" w:unhideWhenUsed="1"/>
+    <w:lsdException w:name="toc 2" w:semiHidden="1" w:uiPriority="39" w:unhideWhenUsed="1"/>
+    <w:lsdException w:name="toc 3" w:semiHidden="1" w:uiPriority="39" w:unhideWhenUsed="1"/>
+    <w:lsdException w:name="toc 4" w:semiHidden="1" w:uiPriority="39" w:unhideWhenUsed="1"/>
+    <w:lsdException w:name="toc 5" w:semiHidden="1" w:uiPriority="39" w:unhideWhenUsed="1"/>
+    <w:lsdException w:name="toc 6" w:semiHidden="1" w:uiPriority="39" w:unhideWhenUsed="1"/>
+    <w:lsdException w:name="toc 7" w:semiHidden="1" w:uiPriority="39" w:unhideWhenUsed="1"/>
+    <w:lsdException w:name="toc 8" w:semiHidden="1" w:uiPriority="39" w:unhideWhenUsed="1"/>
+    <w:lsdException w:name="toc 9" w:semiHidden="1" w:uiPriority="39" w:unhideWhenUsed="1"/>
+    <w:lsdException w:name="Normal Indent" w:semiHidden="1" w:unhideWhenUsed="1"/>
+    <w:lsdException w:name="footnote text" w:semiHidden="1" w:unhideWhenUsed="1"/>
+    <w:lsdException w:name="annotation text" w:semiHidden="1" w:unhideWhenUsed="1"/>
+    <w:lsdException w:name="header" w:semiHidden="1" w:unhideWhenUsed="1"/>
+    <w:lsdException w:name="footer" w:semiHidden="1" w:unhideWhenUsed="1"/>
+    <w:lsdException w:name="index heading" w:semiHidden="1" w:unhideWhenUsed="1"/>
+    <w:lsdException w:name="caption" w:semiHidden="1" w:uiPriority="35" w:unhideWhenUsed="1" w:qFormat="1"/>
+    <w:lsdException w:name="table of figures" w:semiHidden="1" w:unhideWhenUsed="1"/>
+    <w:lsdException w:name="envelope address" w:semiHidden="1" w:unhideWhenUsed="1"/>
+    <w:lsdException w:name="envelope return" w:semiHidden="1" w:unhideWhenUsed="1"/>
+    <w:lsdException w:name="footnote reference" w:semiHidden="1" w:unhideWhenUsed="1"/>
+    <w:lsdException w:name="annotation reference" w:semiHidden="1" w:unhideWhenUsed="1"/>
+    <w:lsdException w:name="line number" w:semiHidden="1" w:unhideWhenUsed="1"/>
+    <w:lsdException w:name="page number" w:semiHidden="1" w:unhideWhenUsed="1"/>
+    <w:lsdException w:name="endnote reference" w:semiHidden="1" w:unhideWhenUsed="1"/>
+    <w:lsdException w:name="endnote text" w:semiHidden="1" w:unhideWhenUsed="1"/>
+    <w:lsdException w:name="table of authorities" w:semiHidden="1" w:unhideWhenUsed="1"/>
+    <w:lsdException w:name="macro" w:semiHidden="1" w:unhideWhenUsed="1"/>
+    <w:lsdException w:name="toa heading" w:semiHidden="1" w:unhideWhenUsed="1"/>
+    <w:lsdException w:name="List" w:semiHidden="1" w:unhideWhenUsed="1"/>
+    <w:lsdException w:name="List Bullet" w:semiHidden="1" w:unhideWhenUsed="1"/>
+    <w:lsdException w:name="List Number" w:semiHidden="1" w:unhideWhenUsed="1"/>
+    <w:lsdException w:name="List 2" w:semiHidden="1" w:unhideWhenUsed="1"/>
+    <w:lsdException w:name="List 3" w:semiHidden="1" w:unhideWhenUsed="1"/>
+    <w:lsdException w:name="List 4" w:semiHidden="1" w:unhideWhenUsed="1"/>
+    <w:lsdException w:name="List 5" w:semiHidden="1" w:unhideWhenUsed="1"/>
+    <w:lsdException w:name="List Bullet 2" w:semiHidden="1" w:unhideWhenUsed="1"/>
+    <w:lsdException w:name="List Bullet 3" w:semiHidden="1" w:unhideWhenUsed="1"/>
+    <w:lsdException w:name="List Bullet 4" w:semiHidden="1" w:unhideWhenUsed="1"/>
+    <w:lsdException w:name="List Bullet 5" w:semiHidden="1" w:unhideWhenUsed="1"/>
+    <w:lsdException w:name="List Number 2" w:semiHidden="1" w:unhideWhenUsed="1"/>
+    <w:lsdException w:name="List Number 3" w:semiHidden="1" w:unhideWhenUsed="1"/>
+    <w:lsdException w:name="List Number 4" w:semiHidden="1" w:unhideWhenUsed="1"/>
+    <w:lsdException w:name="List Number 5" w:semiHidden="1" w:unhideWhenUsed="1"/>
+    <w:lsdException w:name="Title" w:uiPriority="10" w:qFormat="1"/>
+    <w:lsdException w:name="Closing" w:semiHidden="1" w:unhideWhenUsed="1"/>
+    <w:lsdException w:name="Signature" w:semiHidden="1" w:unhideWhenUsed="1"/>
+    <w:lsdException w:name="Default Paragraph Font" w:semiHidden="1" w:uiPriority="1" w:unhideWhenUsed="1"/>
+    <w:lsdException w:name="Body Text" w:semiHidden="1" w:unhideWhenUsed="1"/>
+    <w:lsdException w:name="Body Text Indent" w:semiHidden="1" w:unhideWhenUsed="1"/>
+    <w:lsdException w:name="List Continue" w:semiHidden="1" w:unhideWhenUsed="1"/>
+    <w:lsdException w:name="List Continue 2" w:semiHidden="1" w:unhideWhenUsed="1"/>
+    <w:lsdException w:name="List Continue 3" w:semiHidden="1" w:unhideWhenUsed="1"/>
+    <w:lsdException w:name="List Continue 4" w:semiHidden="1" w:unhideWhenUsed="1"/>
+    <w:lsdException w:name="List Continue 5" w:semiHidden="1" w:unhideWhenUsed="1"/>
+    <w:lsdException w:name="Message Header" w:semiHidden="1" w:unhideWhenUsed="1"/>
+    <w:lsdException w:name="Subtitle" w:uiPriority="11" w:qFormat="1"/>
+    <w:lsdException w:name="Salutation" w:semiHidden="1" w:unhideWhenUsed="1"/>
+    <w:lsdException w:name="Date" w:semiHidden="1" w:unhideWhenUsed="1"/>
+    <w:lsdException w:name="Body Text First Indent" w:semiHidden="1" w:unhideWhenUsed="1"/>
+    <w:lsdException w:name="Body Text First Indent 2" w:semiHidden="1" w:unhideWhenUsed="1"/>
+    <w:lsdException w:name="Note Heading" w:semiHidden="1" w:unhideWhenUsed="1"/>
+    <w:lsdException w:name="Body Text 2" w:semiHidden="1" w:unhideWhenUsed="1"/>
+    <w:lsdException w:name="Body Text 3" w:semiHidden="1" w:unhideWhenUsed="1"/>
+    <w:lsdException w:name="Body Text Indent 2" w:semiHidden="1" w:unhideWhenUsed="1"/>
+    <w:lsdException w:name="Body Text Indent 3" w:semiHidden="1" w:unhideWhenUsed="1"/>
+    <w:lsdException w:name="Block Text" w:semiHidden="1" w:unhideWhenUsed="1"/>
+    <w:lsdException w:name="Hyperlink" w:semiHidden="1" w:unhideWhenUsed="1"/>
+    <w:lsdException w:name="FollowedHyperlink" w:semiHidden="1" w:unhideWhenUsed="1"/>
+    <w:lsdException w:name="Strong" w:uiPriority="22" w:qFormat="1"/>
+    <w:lsdException w:name="Emphasis" w:uiPriority="20" w:qFormat="1"/>
+    <w:lsdException w:name="Document Map" w:semiHidden="1" w:unhideWhenUsed="1"/>
+    <w:lsdException w:name="Plain Text" w:semiHidden="1" w:unhideWhenUsed="1"/>
+    <w:lsdException w:name="E-mail Signature" w:semiHidden="1" w:unhideWhenUsed="1"/>
+    <w:lsdException w:name="HTML Top of Form" w:semiHidden="1" w:unhideWhenUsed="1"/>
+    <w:lsdException w:name="HTML Bottom of Form" w:semiHidden="1" w:unhideWhenUsed="1"/>
+    <w:lsdException w:name="Normal (Web)" w:semiHidden="1" w:unhideWhenUsed="1"/>
+    <w:lsdException w:name="HTML Acronym" w:semiHidden="1" w:unhideWhenUsed="1"/>
+    <w:lsdException w:name="HTML Address" w:semiHidden="1" w:unhideWhenUsed="1"/>
+    <w:lsdException w:name="HTML Cite" w:semiHidden="1" w:unhideWhenUsed="1"/>
+    <w:lsdException w:name="HTML Code" w:semiHidden="1" w:unhideWhenUsed="1"/>
+    <w:lsdException w:name="HTML Definition" w:semiHidden="1" w:unhideWhenUsed="1"/>
+    <w:lsdException w:name="HTML Keyboard" w:semiHidden="1" w:unhideWhenUsed="1"/>
+    <w:lsdException w:name="HTML Preformatted" w:semiHidden="1" w:unhideWhenUsed="1"/>
+    <w:lsdException w:name="HTML Sample" w:semiHidden="1" w:unhideWhenUsed="1"/>
+    <w:lsdException w:name="HTML Typewriter" w:semiHidden="1" w:unhideWhenUsed="1"/>
+    <w:lsdException w:name="HTML Variable" w:semiHidden="1" w:unhideWhenUsed="1"/>
+    <w:lsdException w:name="Normal Table" w:semiHidden="1" w:unhideWhenUsed="1"/>
+    <w:lsdException w:name="annotation subject" w:semiHidden="1" w:unhideWhenUsed="1"/>
+    <w:lsdException w:name="No List" w:semiHidden="1" w:unhideWhenUsed="1"/>
+    <w:lsdException w:name="Outline List 1" w:semiHidden="1" w:unhideWhenUsed="1"/>
+    <w:lsdException w:name="Outline List 2" w:semiHidden="1" w:unhideWhenUsed="1"/>
+    <w:lsdException w:name="Outline List 3" w:semiHidden="1" w:unhideWhenUsed="1"/>
+    <w:lsdException w:name="Table Simple 1" w:semiHidden="1" w:unhideWhenUsed="1"/>
+    <w:lsdException w:name="Table Simple 2" w:semiHidden="1" w:unhideWhenUsed="1"/>
+    <w:lsdException w:name="Table Simple 3" w:semiHidden="1" w:unhideWhenUsed="1"/>
+    <w:lsdException w:name="Table Classic 1" w:semiHidden="1" w:unhideWhenUsed="1"/>
+    <w:lsdException w:name="Table Classic 2" w:semiHidden="1" w:unhideWhenUsed="1"/>
+    <w:lsdException w:name="Table Classic 3" w:semiHidden="1" w:unhideWhenUsed="1"/>
+    <w:lsdException w:name="Table Classic 4" w:semiHidden="1" w:unhideWhenUsed="1"/>
+    <w:lsdException w:name="Table Colorful 1" w:semiHidden="1" w:unhideWhenUsed="1"/>
+    <w:lsdException w:name="Table Colorful 2" w:semiHidden="1" w:unhideWhenUsed="1"/>
+    <w:lsdException w:name="Table Colorful 3" w:semiHidden="1" w:unhideWhenUsed="1"/>
+    <w:lsdException w:name="Table Columns 1" w:semiHidden="1" w:unhideWhenUsed="1"/>
+    <w:lsdException w:name="Table Columns 2" w:semiHidden="1" w:unhideWhenUsed="1"/>
+    <w:lsdException w:name="Table Columns 3" w:semiHidden="1" w:unhideWhenUsed="1"/>
+    <w:lsdException w:name="Table Columns 4" w:semiHidden="1" w:unhideWhenUsed="1"/>
+    <w:lsdException w:name="Table Columns 5" w:semiHidden="1" w:unhideWhenUsed="1"/>
+    <w:lsdException w:name="Table Grid 1" w:semiHidden="1" w:unhideWhenUsed="1"/>
+    <w:lsdException w:name="Table Grid 2" w:semiHidden="1" w:unhideWhenUsed="1"/>
+    <w:lsdException w:name="Table Grid 3" w:semiHidden="1" w:unhideWhenUsed="1"/>
+    <w:lsdException w:name="Table Grid 4" w:semiHidden="1" w:unhideWhenUsed="1"/>
+    <w:lsdException w:name="Table Grid 5" w:semiHidden="1" w:unhideWhenUsed="1"/>
+    <w:lsdException w:name="Table Grid 6" w:semiHidden="1" w:unhideWhenUsed="1"/>
+    <w:lsdException w:name="Table Grid 7" w:semiHidden="1" w:unhideWhenUsed="1"/>
+    <w:lsdException w:name="Table Grid 8" w:semiHidden="1" w:unhideWhenUsed="1"/>
+    <w:lsdException w:name="Table List 1" w:semiHidden="1" w:unhideWhenUsed="1"/>
+    <w:lsdException w:name="Table List 2" w:semiHidden="1" w:unhideWhenUsed="1"/>
+    <w:lsdException w:name="Table List 3" w:semiHidden="1" w:unhideWhenUsed="1"/>
+    <w:lsdException w:name="Table List 4" w:semiHidden="1" w:unhideWhenUsed="1"/>
+    <w:lsdException w:name="Table List 5" w:semiHidden="1" w:unhideWhenUsed="1"/>
+    <w:lsdException w:name="Table List 6" w:semiHidden="1" w:unhideWhenUsed="1"/>
+    <w:lsdException w:name="Table List 7" w:semiHidden="1" w:unhideWhenUsed="1"/>
+    <w:lsdException w:name="Table List 8" w:semiHidden="1" w:unhideWhenUsed="1"/>
+    <w:lsdException w:name="Table 3D effects 1" w:semiHidden="1" w:unhideWhenUsed="1"/>
+    <w:lsdException w:name="Table 3D effects 2" w:semiHidden="1" w:unhideWhenUsed="1"/>
+    <w:lsdException w:name="Table 3D effects 3" w:semiHidden="1" w:unhideWhenUsed="1"/>
+    <w:lsdException w:name="Table Contemporary" w:semiHidden="1" w:unhideWhenUsed="1"/>
+    <w:lsdException w:name="Table Elegant" w:semiHidden="1" w:unhideWhenUsed="1"/>
+    <w:lsdException w:name="Table Professional" w:semiHidden="1" w:unhideWhenUsed="1"/>
+    <w:lsdException w:name="Table Subtle 1" w:semiHidden="1" w:unhideWhenUsed="1"/>
+    <w:lsdException w:name="Table Subtle 2" w:semiHidden="1" w:unhideWhenUsed="1"/>
+    <w:lsdException w:name="Table Web 1" w:semiHidden="1" w:unhideWhenUsed="1"/>
+    <w:lsdException w:name="Table Web 2" w:semiHidden="1" w:unhideWhenUsed="1"/>
+    <w:lsdException w:name="Table Web 3" w:semiHidden="1" w:unhideWhenUsed="1"/>
+    <w:lsdException w:name="Balloon Text" w:semiHidden="1" w:unhideWhenUsed="1"/>
+    <w:lsdException w:name="Table Grid" w:uiPriority="59"/>
+    <w:lsdException w:name="Table Theme" w:semiHidden="1" w:unhideWhenUsed="1"/>
+    <w:lsdException w:name="Placeholder Text" w:semiHidden="1"/>
+    <w:lsdException w:name="No Spacing" w:uiPriority="1" w:qFormat="1"/>
+    <w:lsdException w:name="Light Shading" w:uiPriority="60"/>
+    <w:lsdException w:name="Light List" w:uiPriority="61"/>
+    <w:lsdException w:name="Light Grid" w:uiPriority="62"/>
+    <w:lsdException w:name="Medium Shading 1" w:uiPriority="63"/>
+    <w:lsdException w:name="Medium Shading 2" w:uiPriority="64"/>
+    <w:lsdException w:name="Medium List 1" w:uiPriority="65"/>
+    <w:lsdException w:name="Medium List 2" w:uiPriority="66"/>
+    <w:lsdException w:name="Medium Grid 1" w:uiPriority="67"/>
+    <w:lsdException w:name="Medium Grid 2" w:uiPriority="68"/>
+    <w:lsdException w:name="Medium Grid 3" w:uiPriority="69"/>
+    <w:lsdException w:name="Dark List" w:uiPriority="70"/>
+    <w:lsdException w:name="Colorful Shading" w:uiPriority="71"/>
+    <w:lsdException w:name="Colorful List" w:uiPriority="72"/>
+    <w:lsdException w:name="Colorful Grid" w:uiPriority="73"/>
+    <w:lsdException w:name="Light Shading Accent 1" w:uiPriority="60"/>
+    <w:lsdException w:name="Light List Accent 1" w:uiPriority="61"/>
+    <w:lsdException w:name="Light Grid Accent 1" w:uiPriority="62"/>
+    <w:lsdException w:name="Medium Shading 1 Accent 1" w:uiPriority="63"/>
+    <w:lsdException w:name="Medium Shading 2 Accent 1" w:uiPriority="64"/>
+    <w:lsdException w:name="Medium List 1 Accent 1" w:uiPriority="65"/>
+    <w:lsdException w:name="Revision" w:semiHidden="1"/>
+    <w:lsdException w:name="List Paragraph" w:uiPriority="34" w:qFormat="1"/>
+    <w:lsdException w:name="Quote" w:uiPriority="29" w:qFormat="1"/>
+    <w:lsdException w:name="Intense Quote" w:uiPriority="30" w:qFormat="1"/>
+    <w:lsdException w:name="Medium List 2 Accent 1" w:uiPriority="66"/>
+    <w:lsdException w:name="Medium Grid 1 Accent 1" w:uiPriority="67"/>
+    <w:lsdException w:name="Medium Grid 2 Accent 1" w:uiPriority="68"/>
+    <w:lsdException w:name="Medium Grid 3 Accent 1" w:uiPriority="69"/>
+    <w:lsdException w:name="Dark List Accent 1" w:uiPriority="70"/>
+    <w:lsdException w:name="Colorful Shading Accent 1" w:uiPriority="71"/>
+    <w:lsdException w:name="Colorful List Accent 1" w:uiPriority="72"/>
+    <w:lsdException w:name="Colorful Grid Accent 1" w:uiPriority="73"/>
+    <w:lsdException w:name="Light Shading Accent 2" w:uiPriority="60"/>
+    <w:lsdException w:name="Light List Accent 2" w:uiPriority="61"/>
+    <w:lsdException w:name="Light Grid Accent 2" w:uiPriority="62"/>
+    <w:lsdException w:name="Medium Shading 1 Accent 2" w:uiPriority="63"/>
+    <w:lsdException w:name="Medium Shading 2 Accent 2" w:uiPriority="64"/>
+    <w:lsdException w:name="Medium List 1 Accent 2" w:uiPriority="65"/>
+    <w:lsdException w:name="Medium List 2 Accent 2" w:uiPriority="66"/>
+    <w:lsdException w:name="Medium Grid 1 Accent 2" w:uiPriority="67"/>
+    <w:lsdException w:name="Medium Grid 2 Accent 2" w:uiPriority="68"/>
+    <w:lsdException w:name="Medium Grid 3 Accent 2" w:uiPriority="69"/>
+    <w:lsdException w:name="Dark List Accent 2" w:uiPriority="70"/>
+    <w:lsdException w:name="Colorful Shading Accent 2" w:uiPriority="71"/>
+    <w:lsdException w:name="Colorful List Accent 2" w:uiPriority="72"/>
+    <w:lsdException w:name="Colorful Grid Accent 2" w:uiPriority="73"/>
+    <w:lsdException w:name="Light Shading Accent 3" w:uiPriority="60"/>
+    <w:lsdException w:name="Light List Accent 3" w:uiPriority="61"/>
+    <w:lsdException w:name="Light Grid Accent 3" w:uiPriority="62"/>
+    <w:lsdException w:name="Medium Shading 1 Accent 3" w:uiPriority="63"/>
+    <w:lsdException w:name="Medium Shading 2 Accent 3" w:uiPriority="64"/>
+    <w:lsdException w:name="Medium List 1 Accent 3" w:uiPriority="65"/>
+    <w:lsdException w:name="Medium List 2 Accent 3" w:uiPriority="66"/>
+    <w:lsdException w:name="Medium Grid 1 Accent 3" w:uiPriority="67"/>
+    <w:lsdException w:name="Medium Grid 2 Accent 3" w:uiPriority="68"/>
+    <w:lsdException w:name="Medium Grid 3 Accent 3" w:uiPriority="69"/>
+    <w:lsdException w:name="Dark List Accent 3" w:uiPriority="70"/>
+    <w:lsdException w:name="Colorful Shading Accent 3" w:uiPriority="71"/>
+    <w:lsdException w:name="Colorful List Accent 3" w:uiPriority="72"/>
+    <w:lsdException w:name="Colorful Grid Accent 3" w:uiPriority="73"/>
+    <w:lsdException w:name="Light Shading Accent 4" w:uiPriority="60"/>
+    <w:lsdException w:name="Light List Accent 4" w:uiPriority="61"/>
+    <w:lsdException w:name="Light Grid Accent 4" w:uiPriority="62"/>
+    <w:lsdException w:name="Medium Shading 1 Accent 4" w:uiPriority="63"/>
+    <w:lsdException w:name="Medium Shading 2 Accent 4" w:uiPriority="64"/>
+    <w:lsdException w:name="Medium List 1 Accent 4" w:uiPriority="65"/>
+    <w:lsdException w:name="Medium List 2 Accent 4" w:uiPriority="66"/>
+    <w:lsdException w:name="Medium Grid 1 Accent 4" w:uiPriority="67"/>
+    <w:lsdException w:name="Medium Grid 2 Accent 4" w:uiPriority="68"/>
+    <w:lsdException w:name="Medium Grid 3 Accent 4" w:uiPriority="69"/>
+    <w:lsdException w:name="Dark List Accent 4" w:uiPriority="70"/>
+    <w:lsdException w:name="Colorful Shading Accent 4" w:uiPriority="71"/>
+    <w:lsdException w:name="Colorful List Accent 4" w:uiPriority="72"/>
+    <w:lsdException w:name="Colorful Grid Accent 4" w:uiPriority="73"/>
+    <w:lsdException w:name="Light Shading Accent 5" w:uiPriority="60"/>
+    <w:lsdException w:name="Light List Accent 5" w:uiPriority="61"/>
+    <w:lsdException w:name="Light Grid Accent 5" w:uiPriority="62"/>
+    <w:lsdException w:name="Medium Shading 1 Accent 5" w:uiPriority="63"/>
+    <w:lsdException w:name="Medium Shading 2 Accent 5" w:uiPriority="64"/>
+    <w:lsdException w:name="Medium List 1 Accent 5" w:uiPriority="65"/>
+    <w:lsdException w:name="Medium List 2 Accent 5" w:uiPriority="66"/>
+    <w:lsdException w:name="Medium Grid 1 Accent 5" w:uiPriority="67"/>
+    <w:lsdException w:name="Medium Grid 2 Accent 5" w:uiPriority="68"/>
+    <w:lsdException w:name="Medium Grid 3 Accent 5" w:uiPriority="69"/>
+    <w:lsdException w:name="Dark List Accent 5" w:uiPriority="70"/>
+    <w:lsdException w:name="Colorful Shading Accent 5" w:uiPriority="71"/>
+    <w:lsdException w:name="Colorful List Accent 5" w:uiPriority="72"/>
+    <w:lsdException w:name="Colorful Grid Accent 5" w:uiPriority="73"/>
+    <w:lsdException w:name="Light Shading Accent 6" w:uiPriority="60"/>
+    <w:lsdException w:name="Light List Accent 6" w:uiPriority="61"/>
+    <w:lsdException w:name="Light Grid Accent 6" w:uiPriority="62"/>
+    <w:lsdException w:name="Medium Shading 1 Accent 6" w:uiPriority="63"/>
+    <w:lsdException w:name="Medium Shading 2 Accent 6" w:uiPriority="64"/>
+    <w:lsdException w:name="Medium List 1 Accent 6" w:uiPriority="65"/>
+    <w:lsdException w:name="Medium List 2 Accent 6" w:uiPriority="66"/>
+    <w:lsdException w:name="Medium Grid 1 Accent 6" w:uiPriority="67"/>
+    <w:lsdException w:name="Medium Grid 2 Accent 6" w:uiPriority="68"/>
+    <w:lsdException w:name="Medium Grid 3 Accent 6" w:uiPriority="69"/>
+    <w:lsdException w:name="Dark List Accent 6" w:uiPriority="70"/>
+    <w:lsdException w:name="Colorful Shading Accent 6" w:uiPriority="71"/>
+    <w:lsdException w:name="Colorful List Accent 6" w:uiPriority="72"/>
+    <w:lsdException w:name="Colorful Grid Accent 6" w:uiPriority="73"/>
+    <w:lsdException w:name="Subtle Emphasis" w:uiPriority="19" w:qFormat="1"/>
+    <w:lsdException w:name="Intense Emphasis" w:uiPriority="21" w:qFormat="1"/>
+    <w:lsdException w:name="Subtle Reference" w:uiPriority="31" w:qFormat="1"/>
+    <w:lsdException w:name="Intense Reference" w:uiPriority="32" w:qFormat="1"/>
+    <w:lsdException w:name="Book Title" w:uiPriority="33" w:qFormat="1"/>
+    <w:lsdException w:name="Bibliography" w:semiHidden="1" w:uiPriority="37" w:unhideWhenUsed="1"/>
+    <w:lsdException w:name="TOC Heading" w:semiHidden="1" w:uiPriority="39" w:unhideWhenUsed="1" w:qFormat="1"/>
+    <w:lsdException w:name="Plain Table 1" w:uiPriority="41"/>
+    <w:lsdException w:name="Plain Table 2" w:uiPriority="42"/>
+    <w:lsdException w:name="Plain Table 3" w:uiPriority="43"/>
+    <w:lsdException w:name="Plain Table 4" w:uiPriority="44"/>
+    <w:lsdException w:name="Plain Table 5" w:uiPriority="45"/>
+    <w:lsdException w:name="Grid Table Light" w:uiPriority="40"/>
+    <w:lsdException w:name="Grid Table 1 Light" w:uiPriority="46"/>
+    <w:lsdException w:name="Grid Table 2" w:uiPriority="47"/>
+    <w:lsdException w:name="Grid Table 3" w:uiPriority="48"/>
+    <w:lsdException w:name="Grid Table 4" w:uiPriority="49"/>
+    <w:lsdException w:name="Grid Table 5 Dark" w:uiPriority="50"/>
+    <w:lsdException w:name="Grid Table 6 Colorful" w:uiPriority="51"/>
+    <w:lsdException w:name="Grid Table 7 Colorful" w:uiPriority="52"/>
+    <w:lsdException w:name="Grid Table 1 Light Accent 1" w:uiPriority="46"/>
+    <w:lsdException w:name="Grid Table 2 Accent 1" w:uiPriority="47"/>
+    <w:lsdException w:name="Grid Table 3 Accent 1" w:uiPriority="48"/>
+    <w:lsdException w:name="Grid Table 4 Accent 1" w:uiPriority="49"/>
+    <w:lsdException w:name="Grid Table 5 Dark Accent 1" w:uiPriority="50"/>
+    <w:lsdException w:name="Grid Table 6 Colorful Accent 1" w:uiPriority="51"/>
+    <w:lsdException w:name="Grid Table 7 Colorful Accent 1" w:uiPriority="52"/>
+    <w:lsdException w:name="Grid Table 1 Light Accent 2" w:uiPriority="46"/>
+    <w:lsdException w:name="Grid Table 2 Accent 2" w:uiPriority="47"/>
+    <w:lsdException w:name="Grid Table 3 Accent 2" w:uiPriority="48"/>
+    <w:lsdException w:name="Grid Table 4 Accent 2" w:uiPriority="49"/>
+    <w:lsdException w:name="Grid Table 5 Dark Accent 2" w:uiPriority="50"/>
+    <w:lsdException w:name="Grid Table 6 Colorful Accent 2" w:uiPriority="51"/>
+    <w:lsdException w:name="Grid Table 7 Colorful Accent 2" w:uiPriority="52"/>
+    <w:lsdException w:name="Grid Table 1 Light Accent 3" w:uiPriority="46"/>
+    <w:lsdException w:name="Grid Table 2 Accent 3" w:uiPriority="47"/>
+    <w:lsdException w:name="Grid Table 3 Accent 3" w:uiPriority="48"/>
+    <w:lsdException w:name="Grid Table 4 Accent 3" w:uiPriority="49"/>
+    <w:lsdException w:name="Grid Table 5 Dark Accent 3" w:uiPriority="50"/>
+    <w:lsdException w:name="Grid Table 6 Colorful Accent 3" w:uiPriority="51"/>
+    <w:lsdException w:name="Grid Table 7 Colorful Accent 3" w:uiPriority="52"/>
+    <w:lsdException w:name="Grid Table 1 Light Accent 4" w:uiPriority="46"/>
+    <w:lsdException w:name="Grid Table 2 Accent 4" w:uiPriority="47"/>
+    <w:lsdException w:name="Grid Table 3 Accent 4" w:uiPriority="48"/>
+    <w:lsdException w:name="Grid Table 4 Accent 4" w:uiPriority="49"/>
+    <w:lsdException w:name="Grid Table 5 Dark Accent 4" w:uiPriority="50"/>
+    <w:lsdException w:name="Grid Table 6 Colorful Accent 4" w:uiPriority="51"/>
+    <w:lsdException w:name="Grid Table 7 Colorful Accent 4" w:uiPriority="52"/>
+    <w:lsdException w:name="Grid Table 1 Light Accent 5" w:uiPriority="46"/>
+    <w:lsdException w:name="Grid Table 2 Accent 5" w:uiPriority="47"/>
+    <w:lsdException w:name="Grid Table 3 Accent 5" w:uiPriority="48"/>
+    <w:lsdException w:name="Grid Table 4 Accent 5" w:uiPriority="49"/>
+    <w:lsdException w:name="Grid Table 5 Dark Accent 5" w:uiPriority="50"/>
+    <w:lsdException w:name="Grid Table 6 Colorful Accent 5" w:uiPriority="51"/>
+    <w:lsdException w:name="Grid Table 7 Colorful Accent 5" w:uiPriority="52"/>
+    <w:lsdException w:name="Grid Table 1 Light Accent 6" w:uiPriority="46"/>
+    <w:lsdException w:name="Grid Table 2 Accent 6" w:uiPriority="47"/>
+    <w:lsdException w:name="Grid Table 3 Accent 6" w:uiPriority="48"/>
+    <w:lsdException w:name="Grid Table 4 Accent 6" w:uiPriority="49"/>
+    <w:lsdException w:name="Grid Table 5 Dark Accent 6" w:uiPriority="50"/>
+    <w:lsdException w:name="Grid Table 6 Colorful Accent 6" w:uiPriority="51"/>
+    <w:lsdException w:name="Grid Table 7 Colorful Accent 6" w:uiPriority="52"/>
+    <w:lsdException w:name="List Table 1 Light" w:uiPriority="46"/>
+    <w:lsdException w:name="List Table 2" w:uiPriority="47"/>
+    <w:lsdException w:name="List Table 3" w:uiPriority="48"/>
+    <w:lsdException w:name="List Table 4" w:uiPriority="49"/>
+    <w:lsdException w:name="List Table 5 Dark" w:uiPriority="50"/>
+    <w:lsdException w:name="List Table 6 Colorful" w:uiPriority="51"/>
+    <w:lsdException w:name="List Table 7 Colorful" w:uiPriority="52"/>
+    <w:lsdException w:name="List Table 1 Light Accent 1" w:uiPriority="46"/>
+    <w:lsdException w:name="List Table 2 Accent 1" w:uiPriority="47"/>
+    <w:lsdException w:name="List Table 3 Accent 1" w:uiPriority="48"/>
+    <w:lsdException w:name="List Table 4 Accent 1" w:uiPriority="49"/>
+    <w:lsdException w:name="List Table 5 Dark Accent 1" w:uiPriority="50"/>
+    <w:lsdException w:name="List Table 6 Colorful Accent 1" w:uiPriority="51"/>
+    <w:lsdException w:name="List Table 7 Colorful Accent 1" w:uiPriority="52"/>
+    <w:lsdException w:name="List Table 1 Light Accent 2" w:uiPriority="46"/>
+    <w:lsdException w:name="List Table 2 Accent 2" w:uiPriority="47"/>
+    <w:lsdException w:name="List Table 3 Accent 2" w:uiPriority="48"/>
+    <w:lsdException w:name="List Table 4 Accent 2" w:uiPriority="49"/>
+    <w:lsdException w:name="List Table 5 Dark Accent 2" w:uiPriority="50"/>
+    <w:lsdException w:name="List Table 6 Colorful Accent 2" w:uiPriority="51"/>
+    <w:lsdException w:name="List Table 7 Colorful Accent 2" w:uiPriority="52"/>
+    <w:lsdException w:name="List Table 1 Light Accent 3" w:uiPriority="46"/>
+    <w:lsdException w:name="List Table 2 Accent 3" w:uiPriority="47"/>
+    <w:lsdException w:name="List Table 3 Accent 3" w:uiPriority="48"/>
+    <w:lsdException w:name="List Table 4 Accent 3" w:uiPriority="49"/>
+    <w:lsdException w:name="List Table 5 Dark Accent 3" w:uiPriority="50"/>
+    <w:lsdException w:name="List Table 6 Colorful Accent 3" w:uiPriority="51"/>
+    <w:lsdException w:name="List Table 7 Colorful Accent 3" w:uiPriority="52"/>
+    <w:lsdException w:name="List Table 1 Light Accent 4" w:uiPriority="46"/>
+    <w:lsdException w:name="List Table 2 Accent 4" w:uiPriority="47"/>
+    <w:lsdException w:name="List Table 3 Accent 4" w:uiPriority="48"/>
+    <w:lsdException w:name="List Table 4 Accent 4" w:uiPriority="49"/>
+    <w:lsdException w:name="List Table 5 Dark Accent 4" w:uiPriority="50"/>
+    <w:lsdException w:name="List Table 6 Colorful Accent 4" w:uiPriority="51"/>
+    <w:lsdException w:name="List Table 7 Colorful Accent 4" w:uiPriority="52"/>
+    <w:lsdException w:name="List Table 1 Light Accent 5" w:uiPriority="46"/>
+    <w:lsdException w:name="List Table 2 Accent 5" w:uiPriority="47"/>
+    <w:lsdException w:name="List Table 3 Accent 5" w:uiPriority="48"/>
+    <w:lsdException w:name="List Table 4 Accent 5" w:uiPriority="49"/>
+    <w:lsdException w:name="List Table 5 Dark Accent 5" w:uiPriority="50"/>
+    <w:lsdException w:name="List Table 6 Colorful Accent 5" w:uiPriority="51"/>
+    <w:lsdException w:name="List Table 7 Colorful Accent 5" w:uiPriority="52"/>
+    <w:lsdException w:name="List Table 1 Light Accent 6" w:uiPriority="46"/>
+    <w:lsdException w:name="List Table 2 Accent 6" w:uiPriority="47"/>
+    <w:lsdException w:name="List Table 3 Accent 6" w:uiPriority="48"/>
+    <w:lsdException w:name="List Table 4 Accent 6" w:uiPriority="49"/>
+    <w:lsdException w:name="List Table 5 Dark Accent 6" w:uiPriority="50"/>
+    <w:lsdException w:name="List Table 6 Colorful Accent 6" w:uiPriority="51"/>
+    <w:lsdException w:name="List Table 7 Colorful Accent 6" w:uiPriority="52"/>
+    <w:lsdException w:name="Mention" w:semiHidden="1" w:unhideWhenUsed="1"/>
+    <w:lsdException w:name="Smart Hyperlink" w:semiHidden="1" w:unhideWhenUsed="1"/>
+    <w:lsdException w:name="Hashtag" w:semiHidden="1" w:unhideWhenUsed="1"/>
+    <w:lsdException w:name="Unresolved Mention" w:semiHidden="1" w:unhideWhenUsed="1"/>
+    <w:lsdException w:name="Smart Link" w:semiHidden="1" w:unhideWhenUsed="1"/>
   </w:latentStyles>
   <w:style w:type="paragraph" w:default="1" w:styleId="Normal">
     <w:name w:val="Normal"/>

</xml_diff>